<commit_message>
feat(ui): modernize mobile UI, fix contrast hierarchy, streamline headers, and organize docs
</commit_message>
<xml_diff>
--- a/docs/RideSync_Comprehensive_College_Project_Report.docx
+++ b/docs/RideSync_Comprehensive_College_Project_Report.docx
@@ -4,6 +4,7 @@
   <w:body>
     <w:p>
       <w:pPr>
+        <w:spacing w:before="0" w:after="80"/>
         <w:jc w:val="center"/>
       </w:pPr>
       <w:r>
@@ -11,13 +12,14 @@
           <w:rFonts w:ascii="Arial" w:hAnsi="Arial"/>
           <w:b/>
           <w:color w:val="2563EB"/>
-          <w:sz w:val="40"/>
+          <w:sz w:val="38"/>
         </w:rPr>
         <w:t>RIDESYNC: AN INTELLIGENT CAMPUS MOBILITY, ROUTE MATCHING AND DRIVER DISPATCH PLATFORM</w:t>
       </w:r>
     </w:p>
     <w:p>
       <w:pPr>
+        <w:spacing w:after="120"/>
         <w:jc w:val="center"/>
       </w:pPr>
       <w:r>
@@ -25,28 +27,24 @@
           <w:rFonts w:ascii="Arial" w:hAnsi="Arial"/>
           <w:i/>
           <w:color w:val="475569"/>
-          <w:sz w:val="24"/>
+          <w:sz w:val="23"/>
         </w:rPr>
         <w:t>Comprehensive Technical &amp; Architectural Project Report for Academic Evaluation</w:t>
       </w:r>
     </w:p>
     <w:p>
       <w:pPr>
+        <w:spacing w:after="280"/>
         <w:jc w:val="center"/>
       </w:pPr>
       <w:r>
         <w:rPr>
           <w:b/>
           <w:color w:val="0F172A"/>
-          <w:sz w:val="19"/>
+          <w:sz w:val="18"/>
         </w:rPr>
-        <w:t>System Architecture | Algorithms | API Endpoints | Database Schema | Security &amp; Verification</w:t>
+        <w:t>System Architecture | Geodesic Route Fitting | Pessimistic Locking | Security &amp; Verification | Mobile Responsive Design System</w:t>
       </w:r>
-    </w:p>
-    <w:p>
-      <w:pPr>
-        <w:spacing w:after="240"/>
-      </w:pPr>
     </w:p>
     <w:p>
       <w:pPr>
@@ -57,14 +55,14 @@
           <w:rFonts w:ascii="Arial" w:hAnsi="Arial"/>
           <w:b/>
           <w:color w:val="1E3A8A"/>
-          <w:sz w:val="30"/>
+          <w:sz w:val="28"/>
         </w:rPr>
         <w:t>1. Executive Summary &amp; Abstract</w:t>
       </w:r>
     </w:p>
     <w:p>
       <w:r>
-        <w:t>RideSync is an end-to-end, high-performance web-based campus mobility and intelligent dispatch system. Designed specifically to solve last-mile commute challenges across university ecosystems, RideSync provides a unified workspace for student riders, verified campus drivers, and system administrators. By integrating geodesic route-fit algorithms, real-time fallback dispatching, persistent session state management, and 1-tap emergency SOS notifications, RideSync guarantees safety, concurrency control, and operational efficiency.</w:t>
+        <w:t>RideSync is an end-to-end, high-performance web-based campus mobility and intelligent driver dispatch system. Engineered specifically to solve last-mile commute challenges across university ecosystems, RideSync provides a unified workspace for student riders, verified campus drivers, and system administrators. By integrating geodesic route-fit matching algorithms, real-time fallback dispatching, persistent session state management, and 1-tap emergency SOS notifications, RideSync guarantees campus safety, strict concurrency control, and operational efficiency.</w:t>
       </w:r>
     </w:p>
     <w:tbl>
@@ -82,10 +80,10 @@
             <w:tcW w:type="dxa" w:w="9792"/>
             <w:shd w:val="clear" w:color="auto" w:fill="F1F5F9"/>
             <w:tcMar>
-              <w:top w:w="140" w:type="dxa"/>
-              <w:bottom w:w="140" w:type="dxa"/>
-              <w:left w:w="180" w:type="dxa"/>
-              <w:right w:w="180" w:type="dxa"/>
+              <w:top w:w="120" w:type="dxa"/>
+              <w:bottom w:w="120" w:type="dxa"/>
+              <w:left w:w="160" w:type="dxa"/>
+              <w:right w:w="160" w:type="dxa"/>
             </w:tcMar>
           </w:tcPr>
           <w:p>
@@ -99,17 +97,19 @@
                 <w:color w:val="1E293B"/>
                 <w:sz w:val="19"/>
               </w:rPr>
-              <w:t>Key Project Highlights:</w:t>
+              <w:t>Key Project Highlights &amp; Achievements:</w:t>
               <w:br/>
-              <w:t>• Unified Multi-Role Architecture: Rider, Driver, and Admin workspaces operating seamlessly.</w:t>
+              <w:t>• Multi-Role Mobile Responsive Architecture: Unified Rider, Driver, and Admin portals with sticky glassmorphic navigation, safe-area inset compliance, and responsive bottom dock.</w:t>
               <w:br/>
-              <w:t>• Algorithmic Route Matching: Haversine distance, vector direction, and time window fit scoring.</w:t>
+              <w:t>• Algorithmic Route Matching: Haversine geodesic distance calculations, vector direction alignment, and time window fit scoring.</w:t>
               <w:br/>
-              <w:t>• High Concurrency &amp; Lock Protection: Row-level FOR UPDATE transaction locks preventing double claims.</w:t>
+              <w:t>• High Concurrency &amp; Lock Protection: Row-level SELECT ... FOR UPDATE database transaction locks preventing double-claim race conditions.</w:t>
               <w:br/>
-              <w:t>• Enhanced Security &amp; Persistent Sessions: 30-day sliding session windows and immediate revocation for suspended accounts.</w:t>
+              <w:t>• Enhanced Security &amp; Persistent Sessions: 30-day sliding session windows with instant middleware revocation for suspended user accounts.</w:t>
               <w:br/>
-              <w:t>• 100% Quality Pass: 65 automated unit tests passing in PHPUnit with zero regression vulnerabilities.</w:t>
+              <w:t>• Automated AI Driver KYC Verification: Python FastAPI microservice utilizing OpenCV feature matching and document OCR for automated driver onboarding.</w:t>
+              <w:br/>
+              <w:t>• Sub-50ms API Performance &amp; 100% Quality Pass: OPcache TTFB optimizations, session principal caching, and 65 automated unit tests passing in PHPUnit with zero regression vulnerabilities.</w:t>
             </w:r>
           </w:p>
         </w:tc>
@@ -129,14 +129,14 @@
           <w:rFonts w:ascii="Arial" w:hAnsi="Arial"/>
           <w:b/>
           <w:color w:val="1E3A8A"/>
-          <w:sz w:val="30"/>
+          <w:sz w:val="28"/>
         </w:rPr>
         <w:t>2. Technology Stack &amp; System Architecture</w:t>
       </w:r>
     </w:p>
     <w:p>
       <w:r>
-        <w:t>RideSync is engineered using a decoupled, modular Model-View-Controller (MVC) architecture in PHP 8.2 and MySQL/MariaDB, complemented by a responsive Vanilla JavaScript frontend, WebSocket gateway for real-time telemetry, and an external Python AI KYC verification service.</w:t>
+        <w:t>RideSync is engineered using a decoupled, modular Model-View-Controller (MVC) architecture in PHP 8.2 and MySQL/MariaDB 8.4, complemented by a responsive Vanilla JavaScript frontend with centralized CSS design tokens, a Node.js WebSocket gateway for real-time telemetry, and an external Python AI KYC document verification service.</w:t>
       </w:r>
     </w:p>
     <w:tbl>
@@ -161,6 +161,7 @@
               <w:rPr>
                 <w:b/>
                 <w:color w:val="FFFFFF"/>
+                <w:sz w:val="19"/>
               </w:rPr>
               <w:t>Layer / Component</w:t>
             </w:r>
@@ -176,6 +177,7 @@
               <w:rPr>
                 <w:b/>
                 <w:color w:val="FFFFFF"/>
+                <w:sz w:val="19"/>
               </w:rPr>
               <w:t>Technology / Framework</w:t>
             </w:r>
@@ -191,6 +193,7 @@
               <w:rPr>
                 <w:b/>
                 <w:color w:val="FFFFFF"/>
+                <w:sz w:val="19"/>
               </w:rPr>
               <w:t>Technical Purpose &amp; Responsibility</w:t>
             </w:r>
@@ -203,15 +206,18 @@
             <w:tcW w:type="dxa" w:w="3264"/>
             <w:shd w:val="clear" w:color="auto" w:fill="F8FAFC"/>
             <w:tcMar>
-              <w:top w:w="80" w:type="dxa"/>
-              <w:bottom w:w="80" w:type="dxa"/>
-              <w:left w:w="100" w:type="dxa"/>
-              <w:right w:w="100" w:type="dxa"/>
+              <w:top w:w="70" w:type="dxa"/>
+              <w:bottom w:w="70" w:type="dxa"/>
+              <w:left w:w="90" w:type="dxa"/>
+              <w:right w:w="90" w:type="dxa"/>
             </w:tcMar>
           </w:tcPr>
           <w:p>
             <w:r>
-              <w:t>Backend Core</w:t>
+              <w:rPr>
+                <w:sz w:val="18"/>
+              </w:rPr>
+              <w:t>Backend Web Core</w:t>
             </w:r>
           </w:p>
         </w:tc>
@@ -220,15 +226,18 @@
             <w:tcW w:type="dxa" w:w="3264"/>
             <w:shd w:val="clear" w:color="auto" w:fill="F8FAFC"/>
             <w:tcMar>
-              <w:top w:w="80" w:type="dxa"/>
-              <w:bottom w:w="80" w:type="dxa"/>
-              <w:left w:w="100" w:type="dxa"/>
-              <w:right w:w="100" w:type="dxa"/>
+              <w:top w:w="70" w:type="dxa"/>
+              <w:bottom w:w="70" w:type="dxa"/>
+              <w:left w:w="90" w:type="dxa"/>
+              <w:right w:w="90" w:type="dxa"/>
             </w:tcMar>
           </w:tcPr>
           <w:p>
             <w:r>
-              <w:t>PHP 8.2 (Strict Types &amp; Mysqli)</w:t>
+              <w:rPr>
+                <w:sz w:val="18"/>
+              </w:rPr>
+              <w:t>PHP 8.2 (Strict Types, Mysqli, OPcache)</w:t>
             </w:r>
           </w:p>
         </w:tc>
@@ -237,15 +246,18 @@
             <w:tcW w:type="dxa" w:w="3264"/>
             <w:shd w:val="clear" w:color="auto" w:fill="F8FAFC"/>
             <w:tcMar>
-              <w:top w:w="80" w:type="dxa"/>
-              <w:bottom w:w="80" w:type="dxa"/>
-              <w:left w:w="100" w:type="dxa"/>
-              <w:right w:w="100" w:type="dxa"/>
+              <w:top w:w="70" w:type="dxa"/>
+              <w:bottom w:w="70" w:type="dxa"/>
+              <w:left w:w="90" w:type="dxa"/>
+              <w:right w:w="90" w:type="dxa"/>
             </w:tcMar>
           </w:tcPr>
           <w:p>
             <w:r>
-              <w:t>Request handling, authentication middleware, CSRF verification, action routing</w:t>
+              <w:rPr>
+                <w:sz w:val="18"/>
+              </w:rPr>
+              <w:t>Request handling, auth middleware, session principal caching, CSRF token verification, action routing</w:t>
             </w:r>
           </w:p>
         </w:tc>
@@ -256,14 +268,17 @@
             <w:tcW w:type="dxa" w:w="3264"/>
             <w:shd w:val="clear" w:color="auto" w:fill="F8FAFC"/>
             <w:tcMar>
-              <w:top w:w="80" w:type="dxa"/>
-              <w:bottom w:w="80" w:type="dxa"/>
-              <w:left w:w="100" w:type="dxa"/>
-              <w:right w:w="100" w:type="dxa"/>
+              <w:top w:w="70" w:type="dxa"/>
+              <w:bottom w:w="70" w:type="dxa"/>
+              <w:left w:w="90" w:type="dxa"/>
+              <w:right w:w="90" w:type="dxa"/>
             </w:tcMar>
           </w:tcPr>
           <w:p>
             <w:r>
+              <w:rPr>
+                <w:sz w:val="18"/>
+              </w:rPr>
               <w:t>Database Layer</w:t>
             </w:r>
           </w:p>
@@ -273,15 +288,18 @@
             <w:tcW w:type="dxa" w:w="3264"/>
             <w:shd w:val="clear" w:color="auto" w:fill="F8FAFC"/>
             <w:tcMar>
-              <w:top w:w="80" w:type="dxa"/>
-              <w:bottom w:w="80" w:type="dxa"/>
-              <w:left w:w="100" w:type="dxa"/>
-              <w:right w:w="100" w:type="dxa"/>
+              <w:top w:w="70" w:type="dxa"/>
+              <w:bottom w:w="70" w:type="dxa"/>
+              <w:left w:w="90" w:type="dxa"/>
+              <w:right w:w="90" w:type="dxa"/>
             </w:tcMar>
           </w:tcPr>
           <w:p>
             <w:r>
-              <w:t>MySQL / MariaDB 10.4+</w:t>
+              <w:rPr>
+                <w:sz w:val="18"/>
+              </w:rPr>
+              <w:t>MySQL 8.4 / MariaDB 10.4+ (Aiven SSL CA)</w:t>
             </w:r>
           </w:p>
         </w:tc>
@@ -290,15 +308,18 @@
             <w:tcW w:type="dxa" w:w="3264"/>
             <w:shd w:val="clear" w:color="auto" w:fill="F8FAFC"/>
             <w:tcMar>
-              <w:top w:w="80" w:type="dxa"/>
-              <w:bottom w:w="80" w:type="dxa"/>
-              <w:left w:w="100" w:type="dxa"/>
-              <w:right w:w="100" w:type="dxa"/>
+              <w:top w:w="70" w:type="dxa"/>
+              <w:bottom w:w="70" w:type="dxa"/>
+              <w:left w:w="90" w:type="dxa"/>
+              <w:right w:w="90" w:type="dxa"/>
             </w:tcMar>
           </w:tcPr>
           <w:p>
             <w:r>
-              <w:t>ACID relational persistence, spatial indexes, FOR UPDATE locks, migrations</w:t>
+              <w:rPr>
+                <w:sz w:val="18"/>
+              </w:rPr>
+              <w:t>ACID relational persistence, spatial indexes, FOR UPDATE pessimistic locks, automated schema migrations</w:t>
             </w:r>
           </w:p>
         </w:tc>
@@ -309,15 +330,18 @@
             <w:tcW w:type="dxa" w:w="3264"/>
             <w:shd w:val="clear" w:color="auto" w:fill="F8FAFC"/>
             <w:tcMar>
-              <w:top w:w="80" w:type="dxa"/>
-              <w:bottom w:w="80" w:type="dxa"/>
-              <w:left w:w="100" w:type="dxa"/>
-              <w:right w:w="100" w:type="dxa"/>
+              <w:top w:w="70" w:type="dxa"/>
+              <w:bottom w:w="70" w:type="dxa"/>
+              <w:left w:w="90" w:type="dxa"/>
+              <w:right w:w="90" w:type="dxa"/>
             </w:tcMar>
           </w:tcPr>
           <w:p>
             <w:r>
-              <w:t>Frontend &amp; UI</w:t>
+              <w:rPr>
+                <w:sz w:val="18"/>
+              </w:rPr>
+              <w:t>Frontend &amp; Design System</w:t>
             </w:r>
           </w:p>
         </w:tc>
@@ -326,15 +350,18 @@
             <w:tcW w:type="dxa" w:w="3264"/>
             <w:shd w:val="clear" w:color="auto" w:fill="F8FAFC"/>
             <w:tcMar>
-              <w:top w:w="80" w:type="dxa"/>
-              <w:bottom w:w="80" w:type="dxa"/>
-              <w:left w:w="100" w:type="dxa"/>
-              <w:right w:w="100" w:type="dxa"/>
+              <w:top w:w="70" w:type="dxa"/>
+              <w:bottom w:w="70" w:type="dxa"/>
+              <w:left w:w="90" w:type="dxa"/>
+              <w:right w:w="90" w:type="dxa"/>
             </w:tcMar>
           </w:tcPr>
           <w:p>
             <w:r>
-              <w:t>Vanilla JS (ES6+), Modern CSS</w:t>
+              <w:rPr>
+                <w:sz w:val="18"/>
+              </w:rPr>
+              <w:t>Vanilla JS (ES6+), Glassmorphic CSS</w:t>
             </w:r>
           </w:p>
         </w:tc>
@@ -343,15 +370,18 @@
             <w:tcW w:type="dxa" w:w="3264"/>
             <w:shd w:val="clear" w:color="auto" w:fill="F8FAFC"/>
             <w:tcMar>
-              <w:top w:w="80" w:type="dxa"/>
-              <w:bottom w:w="80" w:type="dxa"/>
-              <w:left w:w="100" w:type="dxa"/>
-              <w:right w:w="100" w:type="dxa"/>
+              <w:top w:w="70" w:type="dxa"/>
+              <w:bottom w:w="70" w:type="dxa"/>
+              <w:left w:w="90" w:type="dxa"/>
+              <w:right w:w="90" w:type="dxa"/>
             </w:tcMar>
           </w:tcPr>
           <w:p>
             <w:r>
-              <w:t>Glassmorphic modals, notification toasts, live tracking polling, tab visibility management</w:t>
+              <w:rPr>
+                <w:sz w:val="18"/>
+              </w:rPr>
+              <w:t>Design tokens scale, responsive glassmorphic cards, notification toasts, live tracking, mobile bottom dock</w:t>
             </w:r>
           </w:p>
         </w:tc>
@@ -362,14 +392,17 @@
             <w:tcW w:type="dxa" w:w="3264"/>
             <w:shd w:val="clear" w:color="auto" w:fill="F8FAFC"/>
             <w:tcMar>
-              <w:top w:w="80" w:type="dxa"/>
-              <w:bottom w:w="80" w:type="dxa"/>
-              <w:left w:w="100" w:type="dxa"/>
-              <w:right w:w="100" w:type="dxa"/>
+              <w:top w:w="70" w:type="dxa"/>
+              <w:bottom w:w="70" w:type="dxa"/>
+              <w:left w:w="90" w:type="dxa"/>
+              <w:right w:w="90" w:type="dxa"/>
             </w:tcMar>
           </w:tcPr>
           <w:p>
             <w:r>
+              <w:rPr>
+                <w:sz w:val="18"/>
+              </w:rPr>
               <w:t>Geolocation &amp; Maps</w:t>
             </w:r>
           </w:p>
@@ -379,14 +412,17 @@
             <w:tcW w:type="dxa" w:w="3264"/>
             <w:shd w:val="clear" w:color="auto" w:fill="F8FAFC"/>
             <w:tcMar>
-              <w:top w:w="80" w:type="dxa"/>
-              <w:bottom w:w="80" w:type="dxa"/>
-              <w:left w:w="100" w:type="dxa"/>
-              <w:right w:w="100" w:type="dxa"/>
+              <w:top w:w="70" w:type="dxa"/>
+              <w:bottom w:w="70" w:type="dxa"/>
+              <w:left w:w="90" w:type="dxa"/>
+              <w:right w:w="90" w:type="dxa"/>
             </w:tcMar>
           </w:tcPr>
           <w:p>
             <w:r>
+              <w:rPr>
+                <w:sz w:val="18"/>
+              </w:rPr>
               <w:t>OSRM &amp; Leaflet / OpenStreetMap</w:t>
             </w:r>
           </w:p>
@@ -396,15 +432,18 @@
             <w:tcW w:type="dxa" w:w="3264"/>
             <w:shd w:val="clear" w:color="auto" w:fill="F8FAFC"/>
             <w:tcMar>
-              <w:top w:w="80" w:type="dxa"/>
-              <w:bottom w:w="80" w:type="dxa"/>
-              <w:left w:w="100" w:type="dxa"/>
-              <w:right w:w="100" w:type="dxa"/>
+              <w:top w:w="70" w:type="dxa"/>
+              <w:bottom w:w="70" w:type="dxa"/>
+              <w:left w:w="90" w:type="dxa"/>
+              <w:right w:w="90" w:type="dxa"/>
             </w:tcMar>
           </w:tcPr>
           <w:p>
             <w:r>
-              <w:t>Geodesic coordinate routing, pickup ETA calculation, route line rendering</w:t>
+              <w:rPr>
+                <w:sz w:val="18"/>
+              </w:rPr>
+              <w:t>Geodesic coordinate routing, pickup ETA calculation, route line polyline rendering</w:t>
             </w:r>
           </w:p>
         </w:tc>
@@ -415,14 +454,17 @@
             <w:tcW w:type="dxa" w:w="3264"/>
             <w:shd w:val="clear" w:color="auto" w:fill="F8FAFC"/>
             <w:tcMar>
-              <w:top w:w="80" w:type="dxa"/>
-              <w:bottom w:w="80" w:type="dxa"/>
-              <w:left w:w="100" w:type="dxa"/>
-              <w:right w:w="100" w:type="dxa"/>
+              <w:top w:w="70" w:type="dxa"/>
+              <w:bottom w:w="70" w:type="dxa"/>
+              <w:left w:w="90" w:type="dxa"/>
+              <w:right w:w="90" w:type="dxa"/>
             </w:tcMar>
           </w:tcPr>
           <w:p>
             <w:r>
+              <w:rPr>
+                <w:sz w:val="18"/>
+              </w:rPr>
               <w:t>Realtime Telemetry</w:t>
             </w:r>
           </w:p>
@@ -432,15 +474,18 @@
             <w:tcW w:type="dxa" w:w="3264"/>
             <w:shd w:val="clear" w:color="auto" w:fill="F8FAFC"/>
             <w:tcMar>
-              <w:top w:w="80" w:type="dxa"/>
-              <w:bottom w:w="80" w:type="dxa"/>
-              <w:left w:w="100" w:type="dxa"/>
-              <w:right w:w="100" w:type="dxa"/>
+              <w:top w:w="70" w:type="dxa"/>
+              <w:bottom w:w="70" w:type="dxa"/>
+              <w:left w:w="90" w:type="dxa"/>
+              <w:right w:w="90" w:type="dxa"/>
             </w:tcMar>
           </w:tcPr>
           <w:p>
             <w:r>
-              <w:t>Node.js WebSocket Gateway</w:t>
+              <w:rPr>
+                <w:sz w:val="18"/>
+              </w:rPr>
+              <w:t>Node.js 20+ WebSocket Gateway</w:t>
             </w:r>
           </w:p>
         </w:tc>
@@ -449,15 +494,18 @@
             <w:tcW w:type="dxa" w:w="3264"/>
             <w:shd w:val="clear" w:color="auto" w:fill="F8FAFC"/>
             <w:tcMar>
-              <w:top w:w="80" w:type="dxa"/>
-              <w:bottom w:w="80" w:type="dxa"/>
-              <w:left w:w="100" w:type="dxa"/>
-              <w:right w:w="100" w:type="dxa"/>
+              <w:top w:w="70" w:type="dxa"/>
+              <w:bottom w:w="70" w:type="dxa"/>
+              <w:left w:w="90" w:type="dxa"/>
+              <w:right w:w="90" w:type="dxa"/>
             </w:tcMar>
           </w:tcPr>
           <w:p>
             <w:r>
-              <w:t>Low-latency SOS alerts, driver live location broadcast, admin dashboard push</w:t>
+              <w:rPr>
+                <w:sz w:val="18"/>
+              </w:rPr>
+              <w:t>HMAC SHA-256 signed query tokens, low-latency SOS emergency alerts, driver live location broadcast</w:t>
             </w:r>
           </w:p>
         </w:tc>
@@ -468,15 +516,18 @@
             <w:tcW w:type="dxa" w:w="3264"/>
             <w:shd w:val="clear" w:color="auto" w:fill="F8FAFC"/>
             <w:tcMar>
-              <w:top w:w="80" w:type="dxa"/>
-              <w:bottom w:w="80" w:type="dxa"/>
-              <w:left w:w="100" w:type="dxa"/>
-              <w:right w:w="100" w:type="dxa"/>
+              <w:top w:w="70" w:type="dxa"/>
+              <w:bottom w:w="70" w:type="dxa"/>
+              <w:left w:w="90" w:type="dxa"/>
+              <w:right w:w="90" w:type="dxa"/>
             </w:tcMar>
           </w:tcPr>
           <w:p>
             <w:r>
-              <w:t>AI Verification</w:t>
+              <w:rPr>
+                <w:sz w:val="18"/>
+              </w:rPr>
+              <w:t>AI Driver Verification</w:t>
             </w:r>
           </w:p>
         </w:tc>
@@ -485,15 +536,18 @@
             <w:tcW w:type="dxa" w:w="3264"/>
             <w:shd w:val="clear" w:color="auto" w:fill="F8FAFC"/>
             <w:tcMar>
-              <w:top w:w="80" w:type="dxa"/>
-              <w:bottom w:w="80" w:type="dxa"/>
-              <w:left w:w="100" w:type="dxa"/>
-              <w:right w:w="100" w:type="dxa"/>
+              <w:top w:w="70" w:type="dxa"/>
+              <w:bottom w:w="70" w:type="dxa"/>
+              <w:left w:w="90" w:type="dxa"/>
+              <w:right w:w="90" w:type="dxa"/>
             </w:tcMar>
           </w:tcPr>
           <w:p>
             <w:r>
-              <w:t>Python 3.11 + OpenCV</w:t>
+              <w:rPr>
+                <w:sz w:val="18"/>
+              </w:rPr>
+              <w:t>Python 3.11/3.13 FastAPI + OpenCV</w:t>
             </w:r>
           </w:p>
         </w:tc>
@@ -502,15 +556,18 @@
             <w:tcW w:type="dxa" w:w="3264"/>
             <w:shd w:val="clear" w:color="auto" w:fill="F8FAFC"/>
             <w:tcMar>
-              <w:top w:w="80" w:type="dxa"/>
-              <w:bottom w:w="80" w:type="dxa"/>
-              <w:left w:w="100" w:type="dxa"/>
-              <w:right w:w="100" w:type="dxa"/>
+              <w:top w:w="70" w:type="dxa"/>
+              <w:bottom w:w="70" w:type="dxa"/>
+              <w:left w:w="90" w:type="dxa"/>
+              <w:right w:w="90" w:type="dxa"/>
             </w:tcMar>
           </w:tcPr>
           <w:p>
             <w:r>
-              <w:t>Automated driver KYC document OCR and face match verification service</w:t>
+              <w:rPr>
+                <w:sz w:val="18"/>
+              </w:rPr>
+              <w:t>Automated driver KYC document OCR, facial feature matching, and background verification service</w:t>
             </w:r>
           </w:p>
         </w:tc>
@@ -521,14 +578,79 @@
             <w:tcW w:type="dxa" w:w="3264"/>
             <w:shd w:val="clear" w:color="auto" w:fill="F8FAFC"/>
             <w:tcMar>
-              <w:top w:w="80" w:type="dxa"/>
-              <w:bottom w:w="80" w:type="dxa"/>
-              <w:left w:w="100" w:type="dxa"/>
-              <w:right w:w="100" w:type="dxa"/>
+              <w:top w:w="70" w:type="dxa"/>
+              <w:bottom w:w="70" w:type="dxa"/>
+              <w:left w:w="90" w:type="dxa"/>
+              <w:right w:w="90" w:type="dxa"/>
             </w:tcMar>
           </w:tcPr>
           <w:p>
             <w:r>
+              <w:rPr>
+                <w:sz w:val="18"/>
+              </w:rPr>
+              <w:t>Cloud Infrastructure</w:t>
+            </w:r>
+          </w:p>
+        </w:tc>
+        <w:tc>
+          <w:tcPr>
+            <w:tcW w:type="dxa" w:w="3264"/>
+            <w:shd w:val="clear" w:color="auto" w:fill="F8FAFC"/>
+            <w:tcMar>
+              <w:top w:w="70" w:type="dxa"/>
+              <w:bottom w:w="70" w:type="dxa"/>
+              <w:left w:w="90" w:type="dxa"/>
+              <w:right w:w="90" w:type="dxa"/>
+            </w:tcMar>
+          </w:tcPr>
+          <w:p>
+            <w:r>
+              <w:rPr>
+                <w:sz w:val="18"/>
+              </w:rPr>
+              <w:t>Render Docker Blueprints &amp; Vercel Edge</w:t>
+            </w:r>
+          </w:p>
+        </w:tc>
+        <w:tc>
+          <w:tcPr>
+            <w:tcW w:type="dxa" w:w="3264"/>
+            <w:shd w:val="clear" w:color="auto" w:fill="F8FAFC"/>
+            <w:tcMar>
+              <w:top w:w="70" w:type="dxa"/>
+              <w:bottom w:w="70" w:type="dxa"/>
+              <w:left w:w="90" w:type="dxa"/>
+              <w:right w:w="90" w:type="dxa"/>
+            </w:tcMar>
+          </w:tcPr>
+          <w:p>
+            <w:r>
+              <w:rPr>
+                <w:sz w:val="18"/>
+              </w:rPr>
+              <w:t>Vercel edge reverse proxying, Render Web Service containerization, S3 document storage abstraction</w:t>
+            </w:r>
+          </w:p>
+        </w:tc>
+      </w:tr>
+      <w:tr>
+        <w:tc>
+          <w:tcPr>
+            <w:tcW w:type="dxa" w:w="3264"/>
+            <w:shd w:val="clear" w:color="auto" w:fill="F8FAFC"/>
+            <w:tcMar>
+              <w:top w:w="70" w:type="dxa"/>
+              <w:bottom w:w="70" w:type="dxa"/>
+              <w:left w:w="90" w:type="dxa"/>
+              <w:right w:w="90" w:type="dxa"/>
+            </w:tcMar>
+          </w:tcPr>
+          <w:p>
+            <w:r>
+              <w:rPr>
+                <w:sz w:val="18"/>
+              </w:rPr>
               <w:t>Quality &amp; Testing</w:t>
             </w:r>
           </w:p>
@@ -538,14 +660,17 @@
             <w:tcW w:type="dxa" w:w="3264"/>
             <w:shd w:val="clear" w:color="auto" w:fill="F8FAFC"/>
             <w:tcMar>
-              <w:top w:w="80" w:type="dxa"/>
-              <w:bottom w:w="80" w:type="dxa"/>
-              <w:left w:w="100" w:type="dxa"/>
-              <w:right w:w="100" w:type="dxa"/>
+              <w:top w:w="70" w:type="dxa"/>
+              <w:bottom w:w="70" w:type="dxa"/>
+              <w:left w:w="90" w:type="dxa"/>
+              <w:right w:w="90" w:type="dxa"/>
             </w:tcMar>
           </w:tcPr>
           <w:p>
             <w:r>
+              <w:rPr>
+                <w:sz w:val="18"/>
+              </w:rPr>
               <w:t>PHPUnit 11 &amp; K6 Load Testing</w:t>
             </w:r>
           </w:p>
@@ -555,15 +680,18 @@
             <w:tcW w:type="dxa" w:w="3264"/>
             <w:shd w:val="clear" w:color="auto" w:fill="F8FAFC"/>
             <w:tcMar>
-              <w:top w:w="80" w:type="dxa"/>
-              <w:bottom w:w="80" w:type="dxa"/>
-              <w:left w:w="100" w:type="dxa"/>
-              <w:right w:w="100" w:type="dxa"/>
+              <w:top w:w="70" w:type="dxa"/>
+              <w:bottom w:w="70" w:type="dxa"/>
+              <w:left w:w="90" w:type="dxa"/>
+              <w:right w:w="90" w:type="dxa"/>
             </w:tcMar>
           </w:tcPr>
           <w:p>
             <w:r>
-              <w:t>Automated unit tests, negative security tests, and performance load profiling</w:t>
+              <w:rPr>
+                <w:sz w:val="18"/>
+              </w:rPr>
+              <w:t>65 automated unit tests, negative security tests, session security checks, sub-50ms performance load profiling</w:t>
             </w:r>
           </w:p>
         </w:tc>
@@ -571,7 +699,7 @@
     </w:tbl>
     <w:p>
       <w:pPr>
-        <w:spacing w:after="200"/>
+        <w:spacing w:after="160"/>
       </w:pPr>
     </w:p>
     <w:p>
@@ -583,7 +711,7 @@
           <w:rFonts w:ascii="Arial" w:hAnsi="Arial"/>
           <w:b/>
           <w:color w:val="1E3A8A"/>
-          <w:sz w:val="30"/>
+          <w:sz w:val="28"/>
         </w:rPr>
         <w:t>3. Core Mathematical Models &amp; Algorithms</w:t>
       </w:r>
@@ -597,14 +725,14 @@
           <w:rFonts w:ascii="Arial" w:hAnsi="Arial"/>
           <w:b/>
           <w:color w:val="1D4ED8"/>
-          <w:sz w:val="24"/>
+          <w:sz w:val="23"/>
         </w:rPr>
         <w:t>3.1 Geodesic Route Distance (Haversine Formula)</w:t>
       </w:r>
     </w:p>
     <w:p>
       <w:r>
-        <w:t>To compute accurate spatial distances between pickup coordinates (lat1, lon1) and destination coordinates (lat2, lon2) on Earth, RideSync implements the spherical Haversine formula:</w:t>
+        <w:t>To compute precise spatial distances between pickup coordinates (lat1, lon1) and destination coordinates (lat2, lon2) on Earth, RideSync implements the spherical Haversine formula:</w:t>
       </w:r>
     </w:p>
     <w:tbl>
@@ -622,10 +750,10 @@
             <w:tcW w:type="dxa" w:w="9792"/>
             <w:shd w:val="clear" w:color="auto" w:fill="F1F5F9"/>
             <w:tcMar>
-              <w:top w:w="140" w:type="dxa"/>
-              <w:bottom w:w="140" w:type="dxa"/>
-              <w:left w:w="180" w:type="dxa"/>
-              <w:right w:w="180" w:type="dxa"/>
+              <w:top w:w="120" w:type="dxa"/>
+              <w:bottom w:w="120" w:type="dxa"/>
+              <w:left w:w="160" w:type="dxa"/>
+              <w:right w:w="160" w:type="dxa"/>
             </w:tcMar>
           </w:tcPr>
           <w:p>
@@ -641,7 +769,7 @@
               </w:rPr>
               <w:t>a = sin²(Δlat / 2) + cos(lat1) * cos(lat2) * sin²(Δlon / 2)</w:t>
               <w:br/>
-              <w:t>c = 2 * atan2(√a, √(1−a))</w:t>
+              <w:t>c = 2 * atan2(√a, √(1 − a))</w:t>
               <w:br/>
               <w:t>Distance (d) = R * c   (where Earth Radius R = 6,371 km)</w:t>
             </w:r>
@@ -663,7 +791,7 @@
           <w:rFonts w:ascii="Arial" w:hAnsi="Arial"/>
           <w:b/>
           <w:color w:val="1D4ED8"/>
-          <w:sz w:val="24"/>
+          <w:sz w:val="23"/>
         </w:rPr>
         <w:t>3.2 Route Fit &amp; Compatibility Scoring Equation</w:t>
       </w:r>
@@ -688,10 +816,10 @@
             <w:tcW w:type="dxa" w:w="9792"/>
             <w:shd w:val="clear" w:color="auto" w:fill="F1F5F9"/>
             <w:tcMar>
-              <w:top w:w="140" w:type="dxa"/>
-              <w:bottom w:w="140" w:type="dxa"/>
-              <w:left w:w="180" w:type="dxa"/>
-              <w:right w:w="180" w:type="dxa"/>
+              <w:top w:w="120" w:type="dxa"/>
+              <w:bottom w:w="120" w:type="dxa"/>
+              <w:left w:w="160" w:type="dxa"/>
+              <w:right w:w="160" w:type="dxa"/>
             </w:tcMar>
           </w:tcPr>
           <w:p>
@@ -736,9 +864,9 @@
           <w:rFonts w:ascii="Arial" w:hAnsi="Arial"/>
           <w:b/>
           <w:color w:val="1D4ED8"/>
-          <w:sz w:val="24"/>
+          <w:sz w:val="23"/>
         </w:rPr>
-        <w:t>3.3 Concurrency &amp; Lock Prevention Algorithm</w:t>
+        <w:t>3.3 Concurrency &amp; Pessimistic Lock Prevention Algorithm</w:t>
       </w:r>
     </w:p>
     <w:p>
@@ -761,10 +889,10 @@
             <w:tcW w:type="dxa" w:w="9792"/>
             <w:shd w:val="clear" w:color="auto" w:fill="F1F5F9"/>
             <w:tcMar>
-              <w:top w:w="140" w:type="dxa"/>
-              <w:bottom w:w="140" w:type="dxa"/>
-              <w:left w:w="180" w:type="dxa"/>
-              <w:right w:w="180" w:type="dxa"/>
+              <w:top w:w="120" w:type="dxa"/>
+              <w:bottom w:w="120" w:type="dxa"/>
+              <w:left w:w="160" w:type="dxa"/>
+              <w:right w:w="160" w:type="dxa"/>
             </w:tcMar>
           </w:tcPr>
           <w:p>
@@ -782,7 +910,7 @@
               <w:br/>
               <w:t>2. Acquire Exclusive Lock: SELECT status FROM driver_requests WHERE id = ? FOR UPDATE;</w:t>
               <w:br/>
-              <w:t>3. Validate Status: If status != 'pending', ROLLBACK and return conflict error.</w:t>
+              <w:t>3. Validate Status: If status != 'pending', ROLLBACK transaction and return HTTP 409 conflict error.</w:t>
               <w:br/>
               <w:t>4. Mutate State: UPDATE driver_requests SET status = 'accepted', driver_id = ? WHERE id = ?;</w:t>
               <w:br/>
@@ -806,14 +934,14 @@
           <w:rFonts w:ascii="Arial" w:hAnsi="Arial"/>
           <w:b/>
           <w:color w:val="1D4ED8"/>
-          <w:sz w:val="24"/>
+          <w:sz w:val="23"/>
         </w:rPr>
-        <w:t>3.4 Persistent 30-Day Session Management Algorithm</w:t>
+        <w:t>3.4 Persistent 30-Day Session &amp; Instant Revocation Algorithm</w:t>
       </w:r>
     </w:p>
     <w:p>
       <w:r>
-        <w:t>RideSync implements a non-intrusive persistent session model that keeps authenticated users logged in for 30 days across browser restarts until they explicitly perform a logout:</w:t>
+        <w:t>RideSync implements a non-intrusive persistent session model that keeps authenticated users logged in for 30 days across browser restarts, combined with immediate security enforcement:</w:t>
       </w:r>
     </w:p>
     <w:tbl>
@@ -831,10 +959,10 @@
             <w:tcW w:type="dxa" w:w="9792"/>
             <w:shd w:val="clear" w:color="auto" w:fill="F1F5F9"/>
             <w:tcMar>
-              <w:top w:w="140" w:type="dxa"/>
-              <w:bottom w:w="140" w:type="dxa"/>
-              <w:left w:w="180" w:type="dxa"/>
-              <w:right w:w="180" w:type="dxa"/>
+              <w:top w:w="120" w:type="dxa"/>
+              <w:bottom w:w="120" w:type="dxa"/>
+              <w:left w:w="160" w:type="dxa"/>
+              <w:right w:w="160" w:type="dxa"/>
             </w:tcMar>
           </w:tcPr>
           <w:p>
@@ -854,7 +982,7 @@
               <w:br/>
               <w:t>• Sliding Session Expiry: Inactivity timeout refreshed on every request up to 30 days.</w:t>
               <w:br/>
-              <w:t>• Instant Revocation Middleware: ridesync_validate_session_principal checks user status in DB on every request; if status == 'suspended', session is terminated immediately.</w:t>
+              <w:t>• Instant Revocation Middleware: ridesync_validate_session_principal checks user status in DB on every request; if status == 'suspended', session is terminated immediately and cookies destroyed.</w:t>
             </w:r>
           </w:p>
         </w:tc>
@@ -874,14 +1002,84 @@
           <w:rFonts w:ascii="Arial" w:hAnsi="Arial"/>
           <w:b/>
           <w:color w:val="1E3A8A"/>
-          <w:sz w:val="30"/>
+          <w:sz w:val="28"/>
         </w:rPr>
-        <w:t>4. Database Schema &amp; Data Dictionary</w:t>
+        <w:t>4. Mobile Responsive Design System &amp; UI Architecture</w:t>
       </w:r>
     </w:p>
     <w:p>
       <w:r>
-        <w:t>The RideSync database contains 12 core relational tables configured with foreign key constraints, composite telemetry indexes, and ACID compliance.</w:t>
+        <w:t>RideSync features a modern, mobile-first design system built using Vanilla CSS tokens, glassmorphic styling, and progressive enhancement without heavy external UI dependencies.</w:t>
+      </w:r>
+    </w:p>
+    <w:tbl>
+      <w:tblPr>
+        <w:tblW w:type="auto" w:w="0"/>
+        <w:jc w:val="center"/>
+        <w:tblLook w:firstColumn="1" w:firstRow="1" w:lastColumn="0" w:lastRow="0" w:noHBand="0" w:noVBand="1" w:val="04A0"/>
+      </w:tblPr>
+      <w:tblGrid>
+        <w:gridCol w:w="9792"/>
+      </w:tblGrid>
+      <w:tr>
+        <w:tc>
+          <w:tcPr>
+            <w:tcW w:type="dxa" w:w="9792"/>
+            <w:shd w:val="clear" w:color="auto" w:fill="F1F5F9"/>
+            <w:tcMar>
+              <w:top w:w="120" w:type="dxa"/>
+              <w:bottom w:w="120" w:type="dxa"/>
+              <w:left w:w="160" w:type="dxa"/>
+              <w:right w:w="160" w:type="dxa"/>
+            </w:tcMar>
+          </w:tcPr>
+          <w:p>
+            <w:pPr>
+              <w:spacing w:after="0"/>
+            </w:pPr>
+            <w:r>
+              <w:rPr>
+                <w:rFonts w:ascii="Arial" w:hAnsi="Arial"/>
+                <w:i/>
+                <w:color w:val="1E293B"/>
+                <w:sz w:val="19"/>
+              </w:rPr>
+              <w:t>Design System Specifications:</w:t>
+              <w:br/>
+              <w:t>• Single-Row Sticky Glassmorphic Navbar: Compact top bar housing logo mark, page header, unread alert bell badge, and user profile avatar dropdown.</w:t>
+              <w:br/>
+              <w:t>• Mobile Bottom Navigation Dock: Fixed bottom tab bar providing 1-tap switching between Home, Search/Post, Driver Roster, Reports, and Settings.</w:t>
+              <w:br/>
+              <w:t>• Responsive Table-to-Card Transformations: Complex tabular data automatically transforms into stacked glassmorphic cards on mobile viewports (&lt;768px).</w:t>
+              <w:br/>
+              <w:t>• Ergonomic Touch Targets &amp; Protection: Minimum 44px x 44px interactive tap targets, safe-area-inset padding for notched devices, and disabled auto-zoom (`touch-action: manipulation`).</w:t>
+            </w:r>
+          </w:p>
+        </w:tc>
+      </w:tr>
+    </w:tbl>
+    <w:p>
+      <w:pPr>
+        <w:spacing w:after="120"/>
+      </w:pPr>
+    </w:p>
+    <w:p>
+      <w:pPr>
+        <w:spacing w:before="320" w:after="120"/>
+      </w:pPr>
+      <w:r>
+        <w:rPr>
+          <w:rFonts w:ascii="Arial" w:hAnsi="Arial"/>
+          <w:b/>
+          <w:color w:val="1E3A8A"/>
+          <w:sz w:val="28"/>
+        </w:rPr>
+        <w:t>5. Database Schema &amp; Data Dictionary</w:t>
+      </w:r>
+    </w:p>
+    <w:p>
+      <w:r>
+        <w:t>The RideSync database contains 12 core relational tables configured with foreign key constraints, composite spatial/telemetry indexes, and full ACID compliance.</w:t>
       </w:r>
     </w:p>
     <w:tbl>
@@ -907,6 +1105,7 @@
               <w:rPr>
                 <w:b/>
                 <w:color w:val="FFFFFF"/>
+                <w:sz w:val="19"/>
               </w:rPr>
               <w:t>Table Name</w:t>
             </w:r>
@@ -922,6 +1121,7 @@
               <w:rPr>
                 <w:b/>
                 <w:color w:val="FFFFFF"/>
+                <w:sz w:val="19"/>
               </w:rPr>
               <w:t>Primary Keys / Indexes</w:t>
             </w:r>
@@ -937,6 +1137,7 @@
               <w:rPr>
                 <w:b/>
                 <w:color w:val="FFFFFF"/>
+                <w:sz w:val="19"/>
               </w:rPr>
               <w:t>Key Attributes</w:t>
             </w:r>
@@ -952,6 +1153,7 @@
               <w:rPr>
                 <w:b/>
                 <w:color w:val="FFFFFF"/>
+                <w:sz w:val="19"/>
               </w:rPr>
               <w:t>System Purpose</w:t>
             </w:r>
@@ -964,14 +1166,17 @@
             <w:tcW w:type="dxa" w:w="2448"/>
             <w:shd w:val="clear" w:color="auto" w:fill="F8FAFC"/>
             <w:tcMar>
-              <w:top w:w="80" w:type="dxa"/>
-              <w:bottom w:w="80" w:type="dxa"/>
-              <w:left w:w="100" w:type="dxa"/>
-              <w:right w:w="100" w:type="dxa"/>
+              <w:top w:w="70" w:type="dxa"/>
+              <w:bottom w:w="70" w:type="dxa"/>
+              <w:left w:w="90" w:type="dxa"/>
+              <w:right w:w="90" w:type="dxa"/>
             </w:tcMar>
           </w:tcPr>
           <w:p>
             <w:r>
+              <w:rPr>
+                <w:sz w:val="18"/>
+              </w:rPr>
               <w:t>users</w:t>
             </w:r>
           </w:p>
@@ -981,14 +1186,17 @@
             <w:tcW w:type="dxa" w:w="2448"/>
             <w:shd w:val="clear" w:color="auto" w:fill="F8FAFC"/>
             <w:tcMar>
-              <w:top w:w="80" w:type="dxa"/>
-              <w:bottom w:w="80" w:type="dxa"/>
-              <w:left w:w="100" w:type="dxa"/>
-              <w:right w:w="100" w:type="dxa"/>
+              <w:top w:w="70" w:type="dxa"/>
+              <w:bottom w:w="70" w:type="dxa"/>
+              <w:left w:w="90" w:type="dxa"/>
+              <w:right w:w="90" w:type="dxa"/>
             </w:tcMar>
           </w:tcPr>
           <w:p>
             <w:r>
+              <w:rPr>
+                <w:sz w:val="18"/>
+              </w:rPr>
               <w:t>PRIMARY(id), UNIQUE(email)</w:t>
             </w:r>
           </w:p>
@@ -998,14 +1206,17 @@
             <w:tcW w:type="dxa" w:w="2448"/>
             <w:shd w:val="clear" w:color="auto" w:fill="F8FAFC"/>
             <w:tcMar>
-              <w:top w:w="80" w:type="dxa"/>
-              <w:bottom w:w="80" w:type="dxa"/>
-              <w:left w:w="100" w:type="dxa"/>
-              <w:right w:w="100" w:type="dxa"/>
+              <w:top w:w="70" w:type="dxa"/>
+              <w:bottom w:w="70" w:type="dxa"/>
+              <w:left w:w="90" w:type="dxa"/>
+              <w:right w:w="90" w:type="dxa"/>
             </w:tcMar>
           </w:tcPr>
           <w:p>
             <w:r>
+              <w:rPr>
+                <w:sz w:val="18"/>
+              </w:rPr>
               <w:t>name, email, password, status, role</w:t>
             </w:r>
           </w:p>
@@ -1015,15 +1226,18 @@
             <w:tcW w:type="dxa" w:w="2448"/>
             <w:shd w:val="clear" w:color="auto" w:fill="F8FAFC"/>
             <w:tcMar>
-              <w:top w:w="80" w:type="dxa"/>
-              <w:bottom w:w="80" w:type="dxa"/>
-              <w:left w:w="100" w:type="dxa"/>
-              <w:right w:w="100" w:type="dxa"/>
+              <w:top w:w="70" w:type="dxa"/>
+              <w:bottom w:w="70" w:type="dxa"/>
+              <w:left w:w="90" w:type="dxa"/>
+              <w:right w:w="90" w:type="dxa"/>
             </w:tcMar>
           </w:tcPr>
           <w:p>
             <w:r>
-              <w:t>Rider account credentials &amp; suspension status</w:t>
+              <w:rPr>
+                <w:sz w:val="18"/>
+              </w:rPr>
+              <w:t>Rider account credentials &amp; instant suspension status</w:t>
             </w:r>
           </w:p>
         </w:tc>
@@ -1034,14 +1248,17 @@
             <w:tcW w:type="dxa" w:w="2448"/>
             <w:shd w:val="clear" w:color="auto" w:fill="F8FAFC"/>
             <w:tcMar>
-              <w:top w:w="80" w:type="dxa"/>
-              <w:bottom w:w="80" w:type="dxa"/>
-              <w:left w:w="100" w:type="dxa"/>
-              <w:right w:w="100" w:type="dxa"/>
+              <w:top w:w="70" w:type="dxa"/>
+              <w:bottom w:w="70" w:type="dxa"/>
+              <w:left w:w="90" w:type="dxa"/>
+              <w:right w:w="90" w:type="dxa"/>
             </w:tcMar>
           </w:tcPr>
           <w:p>
             <w:r>
+              <w:rPr>
+                <w:sz w:val="18"/>
+              </w:rPr>
               <w:t>driver_accounts</w:t>
             </w:r>
           </w:p>
@@ -1051,15 +1268,18 @@
             <w:tcW w:type="dxa" w:w="2448"/>
             <w:shd w:val="clear" w:color="auto" w:fill="F8FAFC"/>
             <w:tcMar>
-              <w:top w:w="80" w:type="dxa"/>
-              <w:bottom w:w="80" w:type="dxa"/>
-              <w:left w:w="100" w:type="dxa"/>
-              <w:right w:w="100" w:type="dxa"/>
+              <w:top w:w="70" w:type="dxa"/>
+              <w:bottom w:w="70" w:type="dxa"/>
+              <w:left w:w="90" w:type="dxa"/>
+              <w:right w:w="90" w:type="dxa"/>
             </w:tcMar>
           </w:tcPr>
           <w:p>
             <w:r>
-              <w:t>PRIMARY(id), UNIQUE(email)</w:t>
+              <w:rPr>
+                <w:sz w:val="18"/>
+              </w:rPr>
+              <w:t>PRIMARY(id), UNIQUE(email, phone)</w:t>
             </w:r>
           </w:p>
         </w:tc>
@@ -1068,14 +1288,17 @@
             <w:tcW w:type="dxa" w:w="2448"/>
             <w:shd w:val="clear" w:color="auto" w:fill="F8FAFC"/>
             <w:tcMar>
-              <w:top w:w="80" w:type="dxa"/>
-              <w:bottom w:w="80" w:type="dxa"/>
-              <w:left w:w="100" w:type="dxa"/>
-              <w:right w:w="100" w:type="dxa"/>
+              <w:top w:w="70" w:type="dxa"/>
+              <w:bottom w:w="70" w:type="dxa"/>
+              <w:left w:w="90" w:type="dxa"/>
+              <w:right w:w="90" w:type="dxa"/>
             </w:tcMar>
           </w:tcPr>
           <w:p>
             <w:r>
+              <w:rPr>
+                <w:sz w:val="18"/>
+              </w:rPr>
               <w:t>name, phone, status, availability</w:t>
             </w:r>
           </w:p>
@@ -1085,15 +1308,18 @@
             <w:tcW w:type="dxa" w:w="2448"/>
             <w:shd w:val="clear" w:color="auto" w:fill="F8FAFC"/>
             <w:tcMar>
-              <w:top w:w="80" w:type="dxa"/>
-              <w:bottom w:w="80" w:type="dxa"/>
-              <w:left w:w="100" w:type="dxa"/>
-              <w:right w:w="100" w:type="dxa"/>
+              <w:top w:w="70" w:type="dxa"/>
+              <w:bottom w:w="70" w:type="dxa"/>
+              <w:left w:w="90" w:type="dxa"/>
+              <w:right w:w="90" w:type="dxa"/>
             </w:tcMar>
           </w:tcPr>
           <w:p>
             <w:r>
-              <w:t>Driver credentials, approval state &amp; online status</w:t>
+              <w:rPr>
+                <w:sz w:val="18"/>
+              </w:rPr>
+              <w:t>Driver credentials, approval state &amp; online availability status</w:t>
             </w:r>
           </w:p>
         </w:tc>
@@ -1104,14 +1330,17 @@
             <w:tcW w:type="dxa" w:w="2448"/>
             <w:shd w:val="clear" w:color="auto" w:fill="F8FAFC"/>
             <w:tcMar>
-              <w:top w:w="80" w:type="dxa"/>
-              <w:bottom w:w="80" w:type="dxa"/>
-              <w:left w:w="100" w:type="dxa"/>
-              <w:right w:w="100" w:type="dxa"/>
+              <w:top w:w="70" w:type="dxa"/>
+              <w:bottom w:w="70" w:type="dxa"/>
+              <w:left w:w="90" w:type="dxa"/>
+              <w:right w:w="90" w:type="dxa"/>
             </w:tcMar>
           </w:tcPr>
           <w:p>
             <w:r>
+              <w:rPr>
+                <w:sz w:val="18"/>
+              </w:rPr>
               <w:t>driver_documents</w:t>
             </w:r>
           </w:p>
@@ -1121,14 +1350,17 @@
             <w:tcW w:type="dxa" w:w="2448"/>
             <w:shd w:val="clear" w:color="auto" w:fill="F8FAFC"/>
             <w:tcMar>
-              <w:top w:w="80" w:type="dxa"/>
-              <w:bottom w:w="80" w:type="dxa"/>
-              <w:left w:w="100" w:type="dxa"/>
-              <w:right w:w="100" w:type="dxa"/>
+              <w:top w:w="70" w:type="dxa"/>
+              <w:bottom w:w="70" w:type="dxa"/>
+              <w:left w:w="90" w:type="dxa"/>
+              <w:right w:w="90" w:type="dxa"/>
             </w:tcMar>
           </w:tcPr>
           <w:p>
             <w:r>
+              <w:rPr>
+                <w:sz w:val="18"/>
+              </w:rPr>
               <w:t>PRIMARY(id), idx_driver_doc</w:t>
             </w:r>
           </w:p>
@@ -1138,14 +1370,17 @@
             <w:tcW w:type="dxa" w:w="2448"/>
             <w:shd w:val="clear" w:color="auto" w:fill="F8FAFC"/>
             <w:tcMar>
-              <w:top w:w="80" w:type="dxa"/>
-              <w:bottom w:w="80" w:type="dxa"/>
-              <w:left w:w="100" w:type="dxa"/>
-              <w:right w:w="100" w:type="dxa"/>
+              <w:top w:w="70" w:type="dxa"/>
+              <w:bottom w:w="70" w:type="dxa"/>
+              <w:left w:w="90" w:type="dxa"/>
+              <w:right w:w="90" w:type="dxa"/>
             </w:tcMar>
           </w:tcPr>
           <w:p>
             <w:r>
+              <w:rPr>
+                <w:sz w:val="18"/>
+              </w:rPr>
               <w:t>driver_id, document_type, status</w:t>
             </w:r>
           </w:p>
@@ -1155,15 +1390,18 @@
             <w:tcW w:type="dxa" w:w="2448"/>
             <w:shd w:val="clear" w:color="auto" w:fill="F8FAFC"/>
             <w:tcMar>
-              <w:top w:w="80" w:type="dxa"/>
-              <w:bottom w:w="80" w:type="dxa"/>
-              <w:left w:w="100" w:type="dxa"/>
-              <w:right w:w="100" w:type="dxa"/>
+              <w:top w:w="70" w:type="dxa"/>
+              <w:bottom w:w="70" w:type="dxa"/>
+              <w:left w:w="90" w:type="dxa"/>
+              <w:right w:w="90" w:type="dxa"/>
             </w:tcMar>
           </w:tcPr>
           <w:p>
             <w:r>
-              <w:t>KYC documents (License, Aadhaar, PAN, RC) &amp; review state</w:t>
+              <w:rPr>
+                <w:sz w:val="18"/>
+              </w:rPr>
+              <w:t>KYC documents (License, Aadhaar, PAN, RC) &amp; AI review state</w:t>
             </w:r>
           </w:p>
         </w:tc>
@@ -1174,14 +1412,17 @@
             <w:tcW w:type="dxa" w:w="2448"/>
             <w:shd w:val="clear" w:color="auto" w:fill="F8FAFC"/>
             <w:tcMar>
-              <w:top w:w="80" w:type="dxa"/>
-              <w:bottom w:w="80" w:type="dxa"/>
-              <w:left w:w="100" w:type="dxa"/>
-              <w:right w:w="100" w:type="dxa"/>
+              <w:top w:w="70" w:type="dxa"/>
+              <w:bottom w:w="70" w:type="dxa"/>
+              <w:left w:w="90" w:type="dxa"/>
+              <w:right w:w="90" w:type="dxa"/>
             </w:tcMar>
           </w:tcPr>
           <w:p>
             <w:r>
+              <w:rPr>
+                <w:sz w:val="18"/>
+              </w:rPr>
               <w:t>rides</w:t>
             </w:r>
           </w:p>
@@ -1191,14 +1432,17 @@
             <w:tcW w:type="dxa" w:w="2448"/>
             <w:shd w:val="clear" w:color="auto" w:fill="F8FAFC"/>
             <w:tcMar>
-              <w:top w:w="80" w:type="dxa"/>
-              <w:bottom w:w="80" w:type="dxa"/>
-              <w:left w:w="100" w:type="dxa"/>
-              <w:right w:w="100" w:type="dxa"/>
+              <w:top w:w="70" w:type="dxa"/>
+              <w:bottom w:w="70" w:type="dxa"/>
+              <w:left w:w="90" w:type="dxa"/>
+              <w:right w:w="90" w:type="dxa"/>
             </w:tcMar>
           </w:tcPr>
           <w:p>
             <w:r>
+              <w:rPr>
+                <w:sz w:val="18"/>
+              </w:rPr>
               <w:t>PRIMARY(id), idx_status_date</w:t>
             </w:r>
           </w:p>
@@ -1208,14 +1452,17 @@
             <w:tcW w:type="dxa" w:w="2448"/>
             <w:shd w:val="clear" w:color="auto" w:fill="F8FAFC"/>
             <w:tcMar>
-              <w:top w:w="80" w:type="dxa"/>
-              <w:bottom w:w="80" w:type="dxa"/>
-              <w:left w:w="100" w:type="dxa"/>
-              <w:right w:w="100" w:type="dxa"/>
+              <w:top w:w="70" w:type="dxa"/>
+              <w:bottom w:w="70" w:type="dxa"/>
+              <w:left w:w="90" w:type="dxa"/>
+              <w:right w:w="90" w:type="dxa"/>
             </w:tcMar>
           </w:tcPr>
           <w:p>
             <w:r>
+              <w:rPr>
+                <w:sz w:val="18"/>
+              </w:rPr>
               <w:t>user_id, origin, destination, seats</w:t>
             </w:r>
           </w:p>
@@ -1225,15 +1472,18 @@
             <w:tcW w:type="dxa" w:w="2448"/>
             <w:shd w:val="clear" w:color="auto" w:fill="F8FAFC"/>
             <w:tcMar>
-              <w:top w:w="80" w:type="dxa"/>
-              <w:bottom w:w="80" w:type="dxa"/>
-              <w:left w:w="100" w:type="dxa"/>
-              <w:right w:w="100" w:type="dxa"/>
+              <w:top w:w="70" w:type="dxa"/>
+              <w:bottom w:w="70" w:type="dxa"/>
+              <w:left w:w="90" w:type="dxa"/>
+              <w:right w:w="90" w:type="dxa"/>
             </w:tcMar>
           </w:tcPr>
           <w:p>
             <w:r>
-              <w:t>Posted shared trips and pickup criteria</w:t>
+              <w:rPr>
+                <w:sz w:val="18"/>
+              </w:rPr>
+              <w:t>Posted shared trips and pickup/destination criteria</w:t>
             </w:r>
           </w:p>
         </w:tc>
@@ -1244,14 +1494,17 @@
             <w:tcW w:type="dxa" w:w="2448"/>
             <w:shd w:val="clear" w:color="auto" w:fill="F8FAFC"/>
             <w:tcMar>
-              <w:top w:w="80" w:type="dxa"/>
-              <w:bottom w:w="80" w:type="dxa"/>
-              <w:left w:w="100" w:type="dxa"/>
-              <w:right w:w="100" w:type="dxa"/>
+              <w:top w:w="70" w:type="dxa"/>
+              <w:bottom w:w="70" w:type="dxa"/>
+              <w:left w:w="90" w:type="dxa"/>
+              <w:right w:w="90" w:type="dxa"/>
             </w:tcMar>
           </w:tcPr>
           <w:p>
             <w:r>
+              <w:rPr>
+                <w:sz w:val="18"/>
+              </w:rPr>
               <w:t>driver_requests</w:t>
             </w:r>
           </w:p>
@@ -1261,14 +1514,17 @@
             <w:tcW w:type="dxa" w:w="2448"/>
             <w:shd w:val="clear" w:color="auto" w:fill="F8FAFC"/>
             <w:tcMar>
-              <w:top w:w="80" w:type="dxa"/>
-              <w:bottom w:w="80" w:type="dxa"/>
-              <w:left w:w="100" w:type="dxa"/>
-              <w:right w:w="100" w:type="dxa"/>
+              <w:top w:w="70" w:type="dxa"/>
+              <w:bottom w:w="70" w:type="dxa"/>
+              <w:left w:w="90" w:type="dxa"/>
+              <w:right w:w="90" w:type="dxa"/>
             </w:tcMar>
           </w:tcPr>
           <w:p>
             <w:r>
+              <w:rPr>
+                <w:sz w:val="18"/>
+              </w:rPr>
               <w:t>PRIMARY(id), idx_ride_driver</w:t>
             </w:r>
           </w:p>
@@ -1278,14 +1534,17 @@
             <w:tcW w:type="dxa" w:w="2448"/>
             <w:shd w:val="clear" w:color="auto" w:fill="F8FAFC"/>
             <w:tcMar>
-              <w:top w:w="80" w:type="dxa"/>
-              <w:bottom w:w="80" w:type="dxa"/>
-              <w:left w:w="100" w:type="dxa"/>
-              <w:right w:w="100" w:type="dxa"/>
+              <w:top w:w="70" w:type="dxa"/>
+              <w:bottom w:w="70" w:type="dxa"/>
+              <w:left w:w="90" w:type="dxa"/>
+              <w:right w:w="90" w:type="dxa"/>
             </w:tcMar>
           </w:tcPr>
           <w:p>
             <w:r>
+              <w:rPr>
+                <w:sz w:val="18"/>
+              </w:rPr>
               <w:t>ride_id, driver_id, status, fare</w:t>
             </w:r>
           </w:p>
@@ -1295,15 +1554,18 @@
             <w:tcW w:type="dxa" w:w="2448"/>
             <w:shd w:val="clear" w:color="auto" w:fill="F8FAFC"/>
             <w:tcMar>
-              <w:top w:w="80" w:type="dxa"/>
-              <w:bottom w:w="80" w:type="dxa"/>
-              <w:left w:w="100" w:type="dxa"/>
-              <w:right w:w="100" w:type="dxa"/>
+              <w:top w:w="70" w:type="dxa"/>
+              <w:bottom w:w="70" w:type="dxa"/>
+              <w:left w:w="90" w:type="dxa"/>
+              <w:right w:w="90" w:type="dxa"/>
             </w:tcMar>
           </w:tcPr>
           <w:p>
             <w:r>
-              <w:t>Direct rider-to-driver dispatch requests</w:t>
+              <w:rPr>
+                <w:sz w:val="18"/>
+              </w:rPr>
+              <w:t>Direct rider-to-driver dispatch requests with pessimistic locks</w:t>
             </w:r>
           </w:p>
         </w:tc>
@@ -1314,14 +1576,17 @@
             <w:tcW w:type="dxa" w:w="2448"/>
             <w:shd w:val="clear" w:color="auto" w:fill="F8FAFC"/>
             <w:tcMar>
-              <w:top w:w="80" w:type="dxa"/>
-              <w:bottom w:w="80" w:type="dxa"/>
-              <w:left w:w="100" w:type="dxa"/>
-              <w:right w:w="100" w:type="dxa"/>
+              <w:top w:w="70" w:type="dxa"/>
+              <w:bottom w:w="70" w:type="dxa"/>
+              <w:left w:w="90" w:type="dxa"/>
+              <w:right w:w="90" w:type="dxa"/>
             </w:tcMar>
           </w:tcPr>
           <w:p>
             <w:r>
+              <w:rPr>
+                <w:sz w:val="18"/>
+              </w:rPr>
               <w:t>sos_alerts</w:t>
             </w:r>
           </w:p>
@@ -1331,14 +1596,17 @@
             <w:tcW w:type="dxa" w:w="2448"/>
             <w:shd w:val="clear" w:color="auto" w:fill="F8FAFC"/>
             <w:tcMar>
-              <w:top w:w="80" w:type="dxa"/>
-              <w:bottom w:w="80" w:type="dxa"/>
-              <w:left w:w="100" w:type="dxa"/>
-              <w:right w:w="100" w:type="dxa"/>
+              <w:top w:w="70" w:type="dxa"/>
+              <w:bottom w:w="70" w:type="dxa"/>
+              <w:left w:w="90" w:type="dxa"/>
+              <w:right w:w="90" w:type="dxa"/>
             </w:tcMar>
           </w:tcPr>
           <w:p>
             <w:r>
+              <w:rPr>
+                <w:sz w:val="18"/>
+              </w:rPr>
               <w:t>PRIMARY(id), idx_status_id</w:t>
             </w:r>
           </w:p>
@@ -1348,14 +1616,17 @@
             <w:tcW w:type="dxa" w:w="2448"/>
             <w:shd w:val="clear" w:color="auto" w:fill="F8FAFC"/>
             <w:tcMar>
-              <w:top w:w="80" w:type="dxa"/>
-              <w:bottom w:w="80" w:type="dxa"/>
-              <w:left w:w="100" w:type="dxa"/>
-              <w:right w:w="100" w:type="dxa"/>
+              <w:top w:w="70" w:type="dxa"/>
+              <w:bottom w:w="70" w:type="dxa"/>
+              <w:left w:w="90" w:type="dxa"/>
+              <w:right w:w="90" w:type="dxa"/>
             </w:tcMar>
           </w:tcPr>
           <w:p>
             <w:r>
+              <w:rPr>
+                <w:sz w:val="18"/>
+              </w:rPr>
               <w:t>ride_id, triggered_by_type, lat, lng</w:t>
             </w:r>
           </w:p>
@@ -1365,14 +1636,17 @@
             <w:tcW w:type="dxa" w:w="2448"/>
             <w:shd w:val="clear" w:color="auto" w:fill="F8FAFC"/>
             <w:tcMar>
-              <w:top w:w="80" w:type="dxa"/>
-              <w:bottom w:w="80" w:type="dxa"/>
-              <w:left w:w="100" w:type="dxa"/>
-              <w:right w:w="100" w:type="dxa"/>
+              <w:top w:w="70" w:type="dxa"/>
+              <w:bottom w:w="70" w:type="dxa"/>
+              <w:left w:w="90" w:type="dxa"/>
+              <w:right w:w="90" w:type="dxa"/>
             </w:tcMar>
           </w:tcPr>
           <w:p>
             <w:r>
+              <w:rPr>
+                <w:sz w:val="18"/>
+              </w:rPr>
               <w:t>Active emergency SOS alerts &amp; location coordinates</w:t>
             </w:r>
           </w:p>
@@ -1384,14 +1658,17 @@
             <w:tcW w:type="dxa" w:w="2448"/>
             <w:shd w:val="clear" w:color="auto" w:fill="F8FAFC"/>
             <w:tcMar>
-              <w:top w:w="80" w:type="dxa"/>
-              <w:bottom w:w="80" w:type="dxa"/>
-              <w:left w:w="100" w:type="dxa"/>
-              <w:right w:w="100" w:type="dxa"/>
+              <w:top w:w="70" w:type="dxa"/>
+              <w:bottom w:w="70" w:type="dxa"/>
+              <w:left w:w="90" w:type="dxa"/>
+              <w:right w:w="90" w:type="dxa"/>
             </w:tcMar>
           </w:tcPr>
           <w:p>
             <w:r>
+              <w:rPr>
+                <w:sz w:val="18"/>
+              </w:rPr>
               <w:t>user_emergency_contacts</w:t>
             </w:r>
           </w:p>
@@ -1401,14 +1678,17 @@
             <w:tcW w:type="dxa" w:w="2448"/>
             <w:shd w:val="clear" w:color="auto" w:fill="F8FAFC"/>
             <w:tcMar>
-              <w:top w:w="80" w:type="dxa"/>
-              <w:bottom w:w="80" w:type="dxa"/>
-              <w:left w:w="100" w:type="dxa"/>
-              <w:right w:w="100" w:type="dxa"/>
+              <w:top w:w="70" w:type="dxa"/>
+              <w:bottom w:w="70" w:type="dxa"/>
+              <w:left w:w="90" w:type="dxa"/>
+              <w:right w:w="90" w:type="dxa"/>
             </w:tcMar>
           </w:tcPr>
           <w:p>
             <w:r>
+              <w:rPr>
+                <w:sz w:val="18"/>
+              </w:rPr>
               <w:t>PRIMARY(id), idx_user_role</w:t>
             </w:r>
           </w:p>
@@ -1418,14 +1698,17 @@
             <w:tcW w:type="dxa" w:w="2448"/>
             <w:shd w:val="clear" w:color="auto" w:fill="F8FAFC"/>
             <w:tcMar>
-              <w:top w:w="80" w:type="dxa"/>
-              <w:bottom w:w="80" w:type="dxa"/>
-              <w:left w:w="100" w:type="dxa"/>
-              <w:right w:w="100" w:type="dxa"/>
+              <w:top w:w="70" w:type="dxa"/>
+              <w:bottom w:w="70" w:type="dxa"/>
+              <w:left w:w="90" w:type="dxa"/>
+              <w:right w:w="90" w:type="dxa"/>
             </w:tcMar>
           </w:tcPr>
           <w:p>
             <w:r>
+              <w:rPr>
+                <w:sz w:val="18"/>
+              </w:rPr>
               <w:t>user_id, user_type, name, phone</w:t>
             </w:r>
           </w:p>
@@ -1435,14 +1718,17 @@
             <w:tcW w:type="dxa" w:w="2448"/>
             <w:shd w:val="clear" w:color="auto" w:fill="F8FAFC"/>
             <w:tcMar>
-              <w:top w:w="80" w:type="dxa"/>
-              <w:bottom w:w="80" w:type="dxa"/>
-              <w:left w:w="100" w:type="dxa"/>
-              <w:right w:w="100" w:type="dxa"/>
+              <w:top w:w="70" w:type="dxa"/>
+              <w:bottom w:w="70" w:type="dxa"/>
+              <w:left w:w="90" w:type="dxa"/>
+              <w:right w:w="90" w:type="dxa"/>
             </w:tcMar>
           </w:tcPr>
           <w:p>
             <w:r>
+              <w:rPr>
+                <w:sz w:val="18"/>
+              </w:rPr>
               <w:t>Personal emergency contacts notified on SOS trigger</w:t>
             </w:r>
           </w:p>
@@ -1454,14 +1740,17 @@
             <w:tcW w:type="dxa" w:w="2448"/>
             <w:shd w:val="clear" w:color="auto" w:fill="F8FAFC"/>
             <w:tcMar>
-              <w:top w:w="80" w:type="dxa"/>
-              <w:bottom w:w="80" w:type="dxa"/>
-              <w:left w:w="100" w:type="dxa"/>
-              <w:right w:w="100" w:type="dxa"/>
+              <w:top w:w="70" w:type="dxa"/>
+              <w:bottom w:w="70" w:type="dxa"/>
+              <w:left w:w="90" w:type="dxa"/>
+              <w:right w:w="90" w:type="dxa"/>
             </w:tcMar>
           </w:tcPr>
           <w:p>
             <w:r>
+              <w:rPr>
+                <w:sz w:val="18"/>
+              </w:rPr>
               <w:t>realtime_events</w:t>
             </w:r>
           </w:p>
@@ -1471,14 +1760,17 @@
             <w:tcW w:type="dxa" w:w="2448"/>
             <w:shd w:val="clear" w:color="auto" w:fill="F8FAFC"/>
             <w:tcMar>
-              <w:top w:w="80" w:type="dxa"/>
-              <w:bottom w:w="80" w:type="dxa"/>
-              <w:left w:w="100" w:type="dxa"/>
-              <w:right w:w="100" w:type="dxa"/>
+              <w:top w:w="70" w:type="dxa"/>
+              <w:bottom w:w="70" w:type="dxa"/>
+              <w:left w:w="90" w:type="dxa"/>
+              <w:right w:w="90" w:type="dxa"/>
             </w:tcMar>
           </w:tcPr>
           <w:p>
             <w:r>
+              <w:rPr>
+                <w:sz w:val="18"/>
+              </w:rPr>
               <w:t>PRIMARY(id), UNIQUE(idempotency)</w:t>
             </w:r>
           </w:p>
@@ -1488,14 +1780,17 @@
             <w:tcW w:type="dxa" w:w="2448"/>
             <w:shd w:val="clear" w:color="auto" w:fill="F8FAFC"/>
             <w:tcMar>
-              <w:top w:w="80" w:type="dxa"/>
-              <w:bottom w:w="80" w:type="dxa"/>
-              <w:left w:w="100" w:type="dxa"/>
-              <w:right w:w="100" w:type="dxa"/>
+              <w:top w:w="70" w:type="dxa"/>
+              <w:bottom w:w="70" w:type="dxa"/>
+              <w:left w:w="90" w:type="dxa"/>
+              <w:right w:w="90" w:type="dxa"/>
             </w:tcMar>
           </w:tcPr>
           <w:p>
             <w:r>
+              <w:rPr>
+                <w:sz w:val="18"/>
+              </w:rPr>
               <w:t>event_type, audience, payload_json</w:t>
             </w:r>
           </w:p>
@@ -1505,14 +1800,17 @@
             <w:tcW w:type="dxa" w:w="2448"/>
             <w:shd w:val="clear" w:color="auto" w:fill="F8FAFC"/>
             <w:tcMar>
-              <w:top w:w="80" w:type="dxa"/>
-              <w:bottom w:w="80" w:type="dxa"/>
-              <w:left w:w="100" w:type="dxa"/>
-              <w:right w:w="100" w:type="dxa"/>
+              <w:top w:w="70" w:type="dxa"/>
+              <w:bottom w:w="70" w:type="dxa"/>
+              <w:left w:w="90" w:type="dxa"/>
+              <w:right w:w="90" w:type="dxa"/>
             </w:tcMar>
           </w:tcPr>
           <w:p>
             <w:r>
+              <w:rPr>
+                <w:sz w:val="18"/>
+              </w:rPr>
               <w:t>Idempotent event log for WebSocket push notifications</w:t>
             </w:r>
           </w:p>
@@ -1521,7 +1819,7 @@
     </w:tbl>
     <w:p>
       <w:pPr>
-        <w:spacing w:after="200"/>
+        <w:spacing w:after="160"/>
       </w:pPr>
     </w:p>
     <w:p>
@@ -1533,9 +1831,9 @@
           <w:rFonts w:ascii="Arial" w:hAnsi="Arial"/>
           <w:b/>
           <w:color w:val="1E3A8A"/>
-          <w:sz w:val="30"/>
+          <w:sz w:val="28"/>
         </w:rPr>
-        <w:t>5. API Specifications &amp; Action Endpoints</w:t>
+        <w:t>6. API Specifications &amp; Action Endpoints</w:t>
       </w:r>
     </w:p>
     <w:p>
@@ -1566,6 +1864,7 @@
               <w:rPr>
                 <w:b/>
                 <w:color w:val="FFFFFF"/>
+                <w:sz w:val="19"/>
               </w:rPr>
               <w:t>Endpoint / Action Route</w:t>
             </w:r>
@@ -1581,6 +1880,7 @@
               <w:rPr>
                 <w:b/>
                 <w:color w:val="FFFFFF"/>
+                <w:sz w:val="19"/>
               </w:rPr>
               <w:t>Method</w:t>
             </w:r>
@@ -1596,6 +1896,7 @@
               <w:rPr>
                 <w:b/>
                 <w:color w:val="FFFFFF"/>
+                <w:sz w:val="19"/>
               </w:rPr>
               <w:t>Parameters / Payload</w:t>
             </w:r>
@@ -1611,6 +1912,7 @@
               <w:rPr>
                 <w:b/>
                 <w:color w:val="FFFFFF"/>
+                <w:sz w:val="19"/>
               </w:rPr>
               <w:t>Response / Effect</w:t>
             </w:r>
@@ -1623,14 +1925,17 @@
             <w:tcW w:type="dxa" w:w="2448"/>
             <w:shd w:val="clear" w:color="auto" w:fill="F8FAFC"/>
             <w:tcMar>
-              <w:top w:w="80" w:type="dxa"/>
-              <w:bottom w:w="80" w:type="dxa"/>
-              <w:left w:w="100" w:type="dxa"/>
-              <w:right w:w="100" w:type="dxa"/>
+              <w:top w:w="70" w:type="dxa"/>
+              <w:bottom w:w="70" w:type="dxa"/>
+              <w:left w:w="90" w:type="dxa"/>
+              <w:right w:w="90" w:type="dxa"/>
             </w:tcMar>
           </w:tcPr>
           <w:p>
             <w:r>
+              <w:rPr>
+                <w:sz w:val="18"/>
+              </w:rPr>
               <w:t>/api/v1/user_notifications_check.php</w:t>
             </w:r>
           </w:p>
@@ -1640,14 +1945,17 @@
             <w:tcW w:type="dxa" w:w="2448"/>
             <w:shd w:val="clear" w:color="auto" w:fill="F8FAFC"/>
             <w:tcMar>
-              <w:top w:w="80" w:type="dxa"/>
-              <w:bottom w:w="80" w:type="dxa"/>
-              <w:left w:w="100" w:type="dxa"/>
-              <w:right w:w="100" w:type="dxa"/>
+              <w:top w:w="70" w:type="dxa"/>
+              <w:bottom w:w="70" w:type="dxa"/>
+              <w:left w:w="90" w:type="dxa"/>
+              <w:right w:w="90" w:type="dxa"/>
             </w:tcMar>
           </w:tcPr>
           <w:p>
             <w:r>
+              <w:rPr>
+                <w:sz w:val="18"/>
+              </w:rPr>
               <w:t>GET</w:t>
             </w:r>
           </w:p>
@@ -1657,14 +1965,17 @@
             <w:tcW w:type="dxa" w:w="2448"/>
             <w:shd w:val="clear" w:color="auto" w:fill="F8FAFC"/>
             <w:tcMar>
-              <w:top w:w="80" w:type="dxa"/>
-              <w:bottom w:w="80" w:type="dxa"/>
-              <w:left w:w="100" w:type="dxa"/>
-              <w:right w:w="100" w:type="dxa"/>
+              <w:top w:w="70" w:type="dxa"/>
+              <w:bottom w:w="70" w:type="dxa"/>
+              <w:left w:w="90" w:type="dxa"/>
+              <w:right w:w="90" w:type="dxa"/>
             </w:tcMar>
           </w:tcPr>
           <w:p>
             <w:r>
+              <w:rPr>
+                <w:sz w:val="18"/>
+              </w:rPr>
               <w:t>since_id (int)</w:t>
             </w:r>
           </w:p>
@@ -1674,14 +1985,17 @@
             <w:tcW w:type="dxa" w:w="2448"/>
             <w:shd w:val="clear" w:color="auto" w:fill="F8FAFC"/>
             <w:tcMar>
-              <w:top w:w="80" w:type="dxa"/>
-              <w:bottom w:w="80" w:type="dxa"/>
-              <w:left w:w="100" w:type="dxa"/>
-              <w:right w:w="100" w:type="dxa"/>
+              <w:top w:w="70" w:type="dxa"/>
+              <w:bottom w:w="70" w:type="dxa"/>
+              <w:left w:w="90" w:type="dxa"/>
+              <w:right w:w="90" w:type="dxa"/>
             </w:tcMar>
           </w:tcPr>
           <w:p>
             <w:r>
+              <w:rPr>
+                <w:sz w:val="18"/>
+              </w:rPr>
               <w:t>JSON unread count and latest alert toast payload</w:t>
             </w:r>
           </w:p>
@@ -1693,14 +2007,17 @@
             <w:tcW w:type="dxa" w:w="2448"/>
             <w:shd w:val="clear" w:color="auto" w:fill="F8FAFC"/>
             <w:tcMar>
-              <w:top w:w="80" w:type="dxa"/>
-              <w:bottom w:w="80" w:type="dxa"/>
-              <w:left w:w="100" w:type="dxa"/>
-              <w:right w:w="100" w:type="dxa"/>
+              <w:top w:w="70" w:type="dxa"/>
+              <w:bottom w:w="70" w:type="dxa"/>
+              <w:left w:w="90" w:type="dxa"/>
+              <w:right w:w="90" w:type="dxa"/>
             </w:tcMar>
           </w:tcPr>
           <w:p>
             <w:r>
+              <w:rPr>
+                <w:sz w:val="18"/>
+              </w:rPr>
               <w:t>/actions/login_action.php</w:t>
             </w:r>
           </w:p>
@@ -1710,14 +2027,17 @@
             <w:tcW w:type="dxa" w:w="2448"/>
             <w:shd w:val="clear" w:color="auto" w:fill="F8FAFC"/>
             <w:tcMar>
-              <w:top w:w="80" w:type="dxa"/>
-              <w:bottom w:w="80" w:type="dxa"/>
-              <w:left w:w="100" w:type="dxa"/>
-              <w:right w:w="100" w:type="dxa"/>
+              <w:top w:w="70" w:type="dxa"/>
+              <w:bottom w:w="70" w:type="dxa"/>
+              <w:left w:w="90" w:type="dxa"/>
+              <w:right w:w="90" w:type="dxa"/>
             </w:tcMar>
           </w:tcPr>
           <w:p>
             <w:r>
+              <w:rPr>
+                <w:sz w:val="18"/>
+              </w:rPr>
               <w:t>POST</w:t>
             </w:r>
           </w:p>
@@ -1727,14 +2047,17 @@
             <w:tcW w:type="dxa" w:w="2448"/>
             <w:shd w:val="clear" w:color="auto" w:fill="F8FAFC"/>
             <w:tcMar>
-              <w:top w:w="80" w:type="dxa"/>
-              <w:bottom w:w="80" w:type="dxa"/>
-              <w:left w:w="100" w:type="dxa"/>
-              <w:right w:w="100" w:type="dxa"/>
+              <w:top w:w="70" w:type="dxa"/>
+              <w:bottom w:w="70" w:type="dxa"/>
+              <w:left w:w="90" w:type="dxa"/>
+              <w:right w:w="90" w:type="dxa"/>
             </w:tcMar>
           </w:tcPr>
           <w:p>
             <w:r>
+              <w:rPr>
+                <w:sz w:val="18"/>
+              </w:rPr>
               <w:t>email, password, csrf_token</w:t>
             </w:r>
           </w:p>
@@ -1744,15 +2067,18 @@
             <w:tcW w:type="dxa" w:w="2448"/>
             <w:shd w:val="clear" w:color="auto" w:fill="F8FAFC"/>
             <w:tcMar>
-              <w:top w:w="80" w:type="dxa"/>
-              <w:bottom w:w="80" w:type="dxa"/>
-              <w:left w:w="100" w:type="dxa"/>
-              <w:right w:w="100" w:type="dxa"/>
+              <w:top w:w="70" w:type="dxa"/>
+              <w:bottom w:w="70" w:type="dxa"/>
+              <w:left w:w="90" w:type="dxa"/>
+              <w:right w:w="90" w:type="dxa"/>
             </w:tcMar>
           </w:tcPr>
           <w:p>
             <w:r>
-              <w:t>Authenticates user, checks suspension, sets 30-day session</w:t>
+              <w:rPr>
+                <w:sz w:val="18"/>
+              </w:rPr>
+              <w:t>Authenticates user, checks suspension status, sets 30-day session</w:t>
             </w:r>
           </w:p>
         </w:tc>
@@ -1763,14 +2089,17 @@
             <w:tcW w:type="dxa" w:w="2448"/>
             <w:shd w:val="clear" w:color="auto" w:fill="F8FAFC"/>
             <w:tcMar>
-              <w:top w:w="80" w:type="dxa"/>
-              <w:bottom w:w="80" w:type="dxa"/>
-              <w:left w:w="100" w:type="dxa"/>
-              <w:right w:w="100" w:type="dxa"/>
+              <w:top w:w="70" w:type="dxa"/>
+              <w:bottom w:w="70" w:type="dxa"/>
+              <w:left w:w="90" w:type="dxa"/>
+              <w:right w:w="90" w:type="dxa"/>
             </w:tcMar>
           </w:tcPr>
           <w:p>
             <w:r>
+              <w:rPr>
+                <w:sz w:val="18"/>
+              </w:rPr>
               <w:t>/actions/match_action.php</w:t>
             </w:r>
           </w:p>
@@ -1780,14 +2109,17 @@
             <w:tcW w:type="dxa" w:w="2448"/>
             <w:shd w:val="clear" w:color="auto" w:fill="F8FAFC"/>
             <w:tcMar>
-              <w:top w:w="80" w:type="dxa"/>
-              <w:bottom w:w="80" w:type="dxa"/>
-              <w:left w:w="100" w:type="dxa"/>
-              <w:right w:w="100" w:type="dxa"/>
+              <w:top w:w="70" w:type="dxa"/>
+              <w:bottom w:w="70" w:type="dxa"/>
+              <w:left w:w="90" w:type="dxa"/>
+              <w:right w:w="90" w:type="dxa"/>
             </w:tcMar>
           </w:tcPr>
           <w:p>
             <w:r>
+              <w:rPr>
+                <w:sz w:val="18"/>
+              </w:rPr>
               <w:t>POST</w:t>
             </w:r>
           </w:p>
@@ -1797,14 +2129,17 @@
             <w:tcW w:type="dxa" w:w="2448"/>
             <w:shd w:val="clear" w:color="auto" w:fill="F8FAFC"/>
             <w:tcMar>
-              <w:top w:w="80" w:type="dxa"/>
-              <w:bottom w:w="80" w:type="dxa"/>
-              <w:left w:w="100" w:type="dxa"/>
-              <w:right w:w="100" w:type="dxa"/>
+              <w:top w:w="70" w:type="dxa"/>
+              <w:bottom w:w="70" w:type="dxa"/>
+              <w:left w:w="90" w:type="dxa"/>
+              <w:right w:w="90" w:type="dxa"/>
             </w:tcMar>
           </w:tcPr>
           <w:p>
             <w:r>
+              <w:rPr>
+                <w:sz w:val="18"/>
+              </w:rPr>
               <w:t>ride_id, action_type</w:t>
             </w:r>
           </w:p>
@@ -1814,15 +2149,18 @@
             <w:tcW w:type="dxa" w:w="2448"/>
             <w:shd w:val="clear" w:color="auto" w:fill="F8FAFC"/>
             <w:tcMar>
-              <w:top w:w="80" w:type="dxa"/>
-              <w:bottom w:w="80" w:type="dxa"/>
-              <w:left w:w="100" w:type="dxa"/>
-              <w:right w:w="100" w:type="dxa"/>
+              <w:top w:w="70" w:type="dxa"/>
+              <w:bottom w:w="70" w:type="dxa"/>
+              <w:left w:w="90" w:type="dxa"/>
+              <w:right w:w="90" w:type="dxa"/>
             </w:tcMar>
           </w:tcPr>
           <w:p>
             <w:r>
-              <w:t>Creates join request or updates match state with locks</w:t>
+              <w:rPr>
+                <w:sz w:val="18"/>
+              </w:rPr>
+              <w:t>Creates join request or updates match state with transaction locks</w:t>
             </w:r>
           </w:p>
         </w:tc>
@@ -1833,14 +2171,17 @@
             <w:tcW w:type="dxa" w:w="2448"/>
             <w:shd w:val="clear" w:color="auto" w:fill="F8FAFC"/>
             <w:tcMar>
-              <w:top w:w="80" w:type="dxa"/>
-              <w:bottom w:w="80" w:type="dxa"/>
-              <w:left w:w="100" w:type="dxa"/>
-              <w:right w:w="100" w:type="dxa"/>
+              <w:top w:w="70" w:type="dxa"/>
+              <w:bottom w:w="70" w:type="dxa"/>
+              <w:left w:w="90" w:type="dxa"/>
+              <w:right w:w="90" w:type="dxa"/>
             </w:tcMar>
           </w:tcPr>
           <w:p>
             <w:r>
+              <w:rPr>
+                <w:sz w:val="18"/>
+              </w:rPr>
               <w:t>/actions/driver_request_action.php</w:t>
             </w:r>
           </w:p>
@@ -1850,14 +2191,17 @@
             <w:tcW w:type="dxa" w:w="2448"/>
             <w:shd w:val="clear" w:color="auto" w:fill="F8FAFC"/>
             <w:tcMar>
-              <w:top w:w="80" w:type="dxa"/>
-              <w:bottom w:w="80" w:type="dxa"/>
-              <w:left w:w="100" w:type="dxa"/>
-              <w:right w:w="100" w:type="dxa"/>
+              <w:top w:w="70" w:type="dxa"/>
+              <w:bottom w:w="70" w:type="dxa"/>
+              <w:left w:w="90" w:type="dxa"/>
+              <w:right w:w="90" w:type="dxa"/>
             </w:tcMar>
           </w:tcPr>
           <w:p>
             <w:r>
+              <w:rPr>
+                <w:sz w:val="18"/>
+              </w:rPr>
               <w:t>POST</w:t>
             </w:r>
           </w:p>
@@ -1867,14 +2211,17 @@
             <w:tcW w:type="dxa" w:w="2448"/>
             <w:shd w:val="clear" w:color="auto" w:fill="F8FAFC"/>
             <w:tcMar>
-              <w:top w:w="80" w:type="dxa"/>
-              <w:bottom w:w="80" w:type="dxa"/>
-              <w:left w:w="100" w:type="dxa"/>
-              <w:right w:w="100" w:type="dxa"/>
+              <w:top w:w="70" w:type="dxa"/>
+              <w:bottom w:w="70" w:type="dxa"/>
+              <w:left w:w="90" w:type="dxa"/>
+              <w:right w:w="90" w:type="dxa"/>
             </w:tcMar>
           </w:tcPr>
           <w:p>
             <w:r>
+              <w:rPr>
+                <w:sz w:val="18"/>
+              </w:rPr>
               <w:t>action_type, ride_id, fare</w:t>
             </w:r>
           </w:p>
@@ -1884,14 +2231,17 @@
             <w:tcW w:type="dxa" w:w="2448"/>
             <w:shd w:val="clear" w:color="auto" w:fill="F8FAFC"/>
             <w:tcMar>
-              <w:top w:w="80" w:type="dxa"/>
-              <w:bottom w:w="80" w:type="dxa"/>
-              <w:left w:w="100" w:type="dxa"/>
-              <w:right w:w="100" w:type="dxa"/>
+              <w:top w:w="70" w:type="dxa"/>
+              <w:bottom w:w="70" w:type="dxa"/>
+              <w:left w:w="90" w:type="dxa"/>
+              <w:right w:w="90" w:type="dxa"/>
             </w:tcMar>
           </w:tcPr>
           <w:p>
             <w:r>
+              <w:rPr>
+                <w:sz w:val="18"/>
+              </w:rPr>
               <w:t>Executes FOR UPDATE locked driver request claim</w:t>
             </w:r>
           </w:p>
@@ -1903,14 +2253,17 @@
             <w:tcW w:type="dxa" w:w="2448"/>
             <w:shd w:val="clear" w:color="auto" w:fill="F8FAFC"/>
             <w:tcMar>
-              <w:top w:w="80" w:type="dxa"/>
-              <w:bottom w:w="80" w:type="dxa"/>
-              <w:left w:w="100" w:type="dxa"/>
-              <w:right w:w="100" w:type="dxa"/>
+              <w:top w:w="70" w:type="dxa"/>
+              <w:bottom w:w="70" w:type="dxa"/>
+              <w:left w:w="90" w:type="dxa"/>
+              <w:right w:w="90" w:type="dxa"/>
             </w:tcMar>
           </w:tcPr>
           <w:p>
             <w:r>
+              <w:rPr>
+                <w:sz w:val="18"/>
+              </w:rPr>
               <w:t>/actions/emergency_contact_action.php</w:t>
             </w:r>
           </w:p>
@@ -1920,14 +2273,17 @@
             <w:tcW w:type="dxa" w:w="2448"/>
             <w:shd w:val="clear" w:color="auto" w:fill="F8FAFC"/>
             <w:tcMar>
-              <w:top w:w="80" w:type="dxa"/>
-              <w:bottom w:w="80" w:type="dxa"/>
-              <w:left w:w="100" w:type="dxa"/>
-              <w:right w:w="100" w:type="dxa"/>
+              <w:top w:w="70" w:type="dxa"/>
+              <w:bottom w:w="70" w:type="dxa"/>
+              <w:left w:w="90" w:type="dxa"/>
+              <w:right w:w="90" w:type="dxa"/>
             </w:tcMar>
           </w:tcPr>
           <w:p>
             <w:r>
+              <w:rPr>
+                <w:sz w:val="18"/>
+              </w:rPr>
               <w:t>POST</w:t>
             </w:r>
           </w:p>
@@ -1937,14 +2293,17 @@
             <w:tcW w:type="dxa" w:w="2448"/>
             <w:shd w:val="clear" w:color="auto" w:fill="F8FAFC"/>
             <w:tcMar>
-              <w:top w:w="80" w:type="dxa"/>
-              <w:bottom w:w="80" w:type="dxa"/>
-              <w:left w:w="100" w:type="dxa"/>
-              <w:right w:w="100" w:type="dxa"/>
+              <w:top w:w="70" w:type="dxa"/>
+              <w:bottom w:w="70" w:type="dxa"/>
+              <w:left w:w="90" w:type="dxa"/>
+              <w:right w:w="90" w:type="dxa"/>
             </w:tcMar>
           </w:tcPr>
           <w:p>
             <w:r>
+              <w:rPr>
+                <w:sz w:val="18"/>
+              </w:rPr>
               <w:t>action_type, name, phone</w:t>
             </w:r>
           </w:p>
@@ -1954,15 +2313,18 @@
             <w:tcW w:type="dxa" w:w="2448"/>
             <w:shd w:val="clear" w:color="auto" w:fill="F8FAFC"/>
             <w:tcMar>
-              <w:top w:w="80" w:type="dxa"/>
-              <w:bottom w:w="80" w:type="dxa"/>
-              <w:left w:w="100" w:type="dxa"/>
-              <w:right w:w="100" w:type="dxa"/>
+              <w:top w:w="70" w:type="dxa"/>
+              <w:bottom w:w="70" w:type="dxa"/>
+              <w:left w:w="90" w:type="dxa"/>
+              <w:right w:w="90" w:type="dxa"/>
             </w:tcMar>
           </w:tcPr>
           <w:p>
             <w:r>
-              <w:t>Adds/removes user emergency safety contacts</w:t>
+              <w:rPr>
+                <w:sz w:val="18"/>
+              </w:rPr>
+              <w:t>Adds or removes user emergency safety contacts</w:t>
             </w:r>
           </w:p>
         </w:tc>
@@ -1973,14 +2335,17 @@
             <w:tcW w:type="dxa" w:w="2448"/>
             <w:shd w:val="clear" w:color="auto" w:fill="F8FAFC"/>
             <w:tcMar>
-              <w:top w:w="80" w:type="dxa"/>
-              <w:bottom w:w="80" w:type="dxa"/>
-              <w:left w:w="100" w:type="dxa"/>
-              <w:right w:w="100" w:type="dxa"/>
+              <w:top w:w="70" w:type="dxa"/>
+              <w:bottom w:w="70" w:type="dxa"/>
+              <w:left w:w="90" w:type="dxa"/>
+              <w:right w:w="90" w:type="dxa"/>
             </w:tcMar>
           </w:tcPr>
           <w:p>
             <w:r>
+              <w:rPr>
+                <w:sz w:val="18"/>
+              </w:rPr>
               <w:t>/actions/sos_action.php</w:t>
             </w:r>
           </w:p>
@@ -1990,14 +2355,17 @@
             <w:tcW w:type="dxa" w:w="2448"/>
             <w:shd w:val="clear" w:color="auto" w:fill="F8FAFC"/>
             <w:tcMar>
-              <w:top w:w="80" w:type="dxa"/>
-              <w:bottom w:w="80" w:type="dxa"/>
-              <w:left w:w="100" w:type="dxa"/>
-              <w:right w:w="100" w:type="dxa"/>
+              <w:top w:w="70" w:type="dxa"/>
+              <w:bottom w:w="70" w:type="dxa"/>
+              <w:left w:w="90" w:type="dxa"/>
+              <w:right w:w="90" w:type="dxa"/>
             </w:tcMar>
           </w:tcPr>
           <w:p>
             <w:r>
+              <w:rPr>
+                <w:sz w:val="18"/>
+              </w:rPr>
               <w:t>POST</w:t>
             </w:r>
           </w:p>
@@ -2007,14 +2375,17 @@
             <w:tcW w:type="dxa" w:w="2448"/>
             <w:shd w:val="clear" w:color="auto" w:fill="F8FAFC"/>
             <w:tcMar>
-              <w:top w:w="80" w:type="dxa"/>
-              <w:bottom w:w="80" w:type="dxa"/>
-              <w:left w:w="100" w:type="dxa"/>
-              <w:right w:w="100" w:type="dxa"/>
+              <w:top w:w="70" w:type="dxa"/>
+              <w:bottom w:w="70" w:type="dxa"/>
+              <w:left w:w="90" w:type="dxa"/>
+              <w:right w:w="90" w:type="dxa"/>
             </w:tcMar>
           </w:tcPr>
           <w:p>
             <w:r>
+              <w:rPr>
+                <w:sz w:val="18"/>
+              </w:rPr>
               <w:t>ride_id, latitude, longitude</w:t>
             </w:r>
           </w:p>
@@ -2024,15 +2395,18 @@
             <w:tcW w:type="dxa" w:w="2448"/>
             <w:shd w:val="clear" w:color="auto" w:fill="F8FAFC"/>
             <w:tcMar>
-              <w:top w:w="80" w:type="dxa"/>
-              <w:bottom w:w="80" w:type="dxa"/>
-              <w:left w:w="100" w:type="dxa"/>
-              <w:right w:w="100" w:type="dxa"/>
+              <w:top w:w="70" w:type="dxa"/>
+              <w:bottom w:w="70" w:type="dxa"/>
+              <w:left w:w="90" w:type="dxa"/>
+              <w:right w:w="90" w:type="dxa"/>
             </w:tcMar>
           </w:tcPr>
           <w:p>
             <w:r>
-              <w:t>Triggers SOS alert, broadcasts WebSocket event &amp; notifies contacts</w:t>
+              <w:rPr>
+                <w:sz w:val="18"/>
+              </w:rPr>
+              <w:t>Triggers SOS alert, broadcasts WebSocket event &amp; notifies safety contacts</w:t>
             </w:r>
           </w:p>
         </w:tc>
@@ -2040,7 +2414,7 @@
     </w:tbl>
     <w:p>
       <w:pPr>
-        <w:spacing w:after="200"/>
+        <w:spacing w:after="160"/>
       </w:pPr>
     </w:p>
     <w:p>
@@ -2052,14 +2426,14 @@
           <w:rFonts w:ascii="Arial" w:hAnsi="Arial"/>
           <w:b/>
           <w:color w:val="1E3A8A"/>
-          <w:sz w:val="30"/>
+          <w:sz w:val="28"/>
         </w:rPr>
-        <w:t>6. Quality Assurance, Testing &amp; Metrics</w:t>
+        <w:t>7. Security Architecture &amp; Cloud Deployment</w:t>
       </w:r>
     </w:p>
     <w:p>
       <w:r>
-        <w:t>RideSync enforces automated quality gates prior to any deployment:</w:t>
+        <w:t>RideSync incorporates enterprise-grade security mechanisms across data persistence, session management, and deployment topology:</w:t>
       </w:r>
     </w:p>
     <w:tbl>
@@ -2077,10 +2451,10 @@
             <w:tcW w:type="dxa" w:w="9792"/>
             <w:shd w:val="clear" w:color="auto" w:fill="F1F5F9"/>
             <w:tcMar>
-              <w:top w:w="140" w:type="dxa"/>
-              <w:bottom w:w="140" w:type="dxa"/>
-              <w:left w:w="180" w:type="dxa"/>
-              <w:right w:w="180" w:type="dxa"/>
+              <w:top w:w="120" w:type="dxa"/>
+              <w:bottom w:w="120" w:type="dxa"/>
+              <w:left w:w="160" w:type="dxa"/>
+              <w:right w:w="160" w:type="dxa"/>
             </w:tcMar>
           </w:tcPr>
           <w:p>
@@ -2094,11 +2468,81 @@
                 <w:color w:val="1E293B"/>
                 <w:sz w:val="19"/>
               </w:rPr>
-              <w:t>• PHPUnit Test Suite: 65 automated tests covering authentication security, OTP validation, driver locks, and emergency contacts.</w:t>
+              <w:t>Security &amp; DevOps Specifications:</w:t>
               <w:br/>
-              <w:t>• Security Audit Verification: Zero session fixations, strict BCrypt password hashing, CSRF token enforcement on all POST requests.</w:t>
+              <w:t>• Sensitive Document Encryption: Driver KYC documents stored locally or in S3 are encrypted at rest using AES-256-CBC via RIDESYNC_DOCUMENT_ENCRYPTION_KEY.</w:t>
               <w:br/>
-              <w:t>• Load Testing Performance: K6 stress tests validating sub-50ms API response times under high concurrency.</w:t>
+              <w:t>• CSRF &amp; SQL Injection Protection: All state-changing POST endpoints enforce anti-CSRF token verification; database interactions use prepared mysqli statements.</w:t>
+              <w:br/>
+              <w:t>• Content Security Policy (CSP): Dynamic CSP header supporting local/LAN IP WebSocket connections (`connect-src ws://127.0.0.1:8081`).</w:t>
+              <w:br/>
+              <w:t>• Monorepo Cloud Topology: Vercel Edge reverse proxy (`vercel.json`) routing traffic to Render Docker Web Service (`render.yaml`) connected to Managed Aiven MySQL via SSL CA certificate (`ca.pem`).</w:t>
+            </w:r>
+          </w:p>
+        </w:tc>
+      </w:tr>
+    </w:tbl>
+    <w:p>
+      <w:pPr>
+        <w:spacing w:after="120"/>
+      </w:pPr>
+    </w:p>
+    <w:p>
+      <w:pPr>
+        <w:spacing w:before="320" w:after="120"/>
+      </w:pPr>
+      <w:r>
+        <w:rPr>
+          <w:rFonts w:ascii="Arial" w:hAnsi="Arial"/>
+          <w:b/>
+          <w:color w:val="1E3A8A"/>
+          <w:sz w:val="28"/>
+        </w:rPr>
+        <w:t>8. Quality Assurance, Testing &amp; Performance Metrics</w:t>
+      </w:r>
+    </w:p>
+    <w:p>
+      <w:r>
+        <w:t>RideSync enforces automated quality gates prior to any production deployment:</w:t>
+      </w:r>
+    </w:p>
+    <w:tbl>
+      <w:tblPr>
+        <w:tblW w:type="auto" w:w="0"/>
+        <w:jc w:val="center"/>
+        <w:tblLook w:firstColumn="1" w:firstRow="1" w:lastColumn="0" w:lastRow="0" w:noHBand="0" w:noVBand="1" w:val="04A0"/>
+      </w:tblPr>
+      <w:tblGrid>
+        <w:gridCol w:w="9792"/>
+      </w:tblGrid>
+      <w:tr>
+        <w:tc>
+          <w:tcPr>
+            <w:tcW w:type="dxa" w:w="9792"/>
+            <w:shd w:val="clear" w:color="auto" w:fill="F1F5F9"/>
+            <w:tcMar>
+              <w:top w:w="120" w:type="dxa"/>
+              <w:bottom w:w="120" w:type="dxa"/>
+              <w:left w:w="160" w:type="dxa"/>
+              <w:right w:w="160" w:type="dxa"/>
+            </w:tcMar>
+          </w:tcPr>
+          <w:p>
+            <w:pPr>
+              <w:spacing w:after="0"/>
+            </w:pPr>
+            <w:r>
+              <w:rPr>
+                <w:rFonts w:ascii="Arial" w:hAnsi="Arial"/>
+                <w:i/>
+                <w:color w:val="1E293B"/>
+                <w:sz w:val="19"/>
+              </w:rPr>
+              <w:t>• PHPUnit Test Suite: 65 automated unit tests covering authentication security, OTP validation, pessimistic locks, session security, and emergency contacts.</w:t>
+              <w:br/>
+              <w:t>• TTFB Latency Optimization: OPcache bytecode caching, session principal caching, early session unlock, and Gzip compression delivering ultra-low page rendering latencies.</w:t>
+              <w:br/>
+              <w:t>• High Concurrency Stress Testing: K6 load testing validating sub-50ms API response times under high concurrent user load.</w:t>
             </w:r>
           </w:p>
         </w:tc>
@@ -2485,7 +2929,7 @@
     <w:rPr>
       <w:rFonts w:ascii="Arial" w:hAnsi="Arial"/>
       <w:color w:val="1E293B"/>
-      <w:sz w:val="21"/>
+      <w:sz w:val="20"/>
     </w:rPr>
   </w:style>
   <w:style w:type="paragraph" w:styleId="Header">

</xml_diff>